<commit_message>
Referenzen für die Bachelorarbeit
</commit_message>
<xml_diff>
--- a/Deckblatt.docx
+++ b/Deckblatt.docx
@@ -7,9 +7,25 @@
         <w:pBdr/>
         <w:spacing w:after="263"/>
         <w:ind w:right="-390" w:left="-390"/>
-        <w:rPr/>
+        <w:rPr>
+          <w:rFonts w:ascii="Times New Roman" w:hAnsi="Times New Roman" w:cs="Times New Roman"/>
+          <w:sz w:val="22"/>
+          <w:szCs w:val="24"/>
+        </w:rPr>
       </w:pPr>
       <w:r>
+        <w:rPr>
+          <w:rFonts w:ascii="Times New Roman" w:hAnsi="Times New Roman" w:eastAsia="Times New Roman" w:cs="Times New Roman"/>
+          <w:sz w:val="22"/>
+          <w:szCs w:val="24"/>
+        </w:rPr>
+      </w:r>
+      <w:r>
+        <w:rPr>
+          <w:rFonts w:ascii="Times New Roman" w:hAnsi="Times New Roman" w:eastAsia="Times New Roman" w:cs="Times New Roman"/>
+          <w:sz w:val="22"/>
+          <w:szCs w:val="24"/>
+        </w:rPr>
         <mc:AlternateContent>
           <mc:Choice Requires="wpg">
             <w:drawing>
@@ -54,13 +70,7 @@
                                 <w:ind/>
                                 <w:rPr/>
                               </w:pPr>
-                              <w:r>
-                                <w:rPr>
-                                  <w:b/>
-                                  <w:sz w:val="32"/>
-                                </w:rPr>
-                                <w:t xml:space="preserve"> </w:t>
-                              </w:r>
+                              <w:r/>
                               <w:r/>
                             </w:p>
                           </w:txbxContent>
@@ -152,13 +162,7 @@
                                 <w:ind/>
                                 <w:rPr/>
                               </w:pPr>
-                              <w:r>
-                                <w:rPr>
-                                  <w:b/>
-                                  <w:sz w:val="36"/>
-                                </w:rPr>
-                                <w:t xml:space="preserve"> </w:t>
-                              </w:r>
+                              <w:r/>
                               <w:r/>
                             </w:p>
                           </w:txbxContent>
@@ -206,13 +210,7 @@
                           <w:ind/>
                           <w:rPr/>
                         </w:pPr>
-                        <w:r>
-                          <w:rPr>
-                            <w:b/>
-                            <w:sz w:val="32"/>
-                          </w:rPr>
-                          <w:t xml:space="preserve"> </w:t>
-                        </w:r>
+                        <w:r/>
                         <w:r/>
                       </w:p>
                     </w:txbxContent>
@@ -231,13 +229,7 @@
                           <w:ind/>
                           <w:rPr/>
                         </w:pPr>
-                        <w:r>
-                          <w:rPr>
-                            <w:b/>
-                            <w:sz w:val="36"/>
-                          </w:rPr>
-                          <w:t xml:space="preserve"> </w:t>
-                        </w:r>
+                        <w:r/>
                         <w:r/>
                       </w:p>
                     </w:txbxContent>
@@ -271,7 +263,13 @@
           </mc:Fallback>
         </mc:AlternateContent>
       </w:r>
-      <w:r/>
+      <w:r>
+        <w:rPr>
+          <w:rFonts w:ascii="Times New Roman" w:hAnsi="Times New Roman" w:eastAsia="Times New Roman" w:cs="Times New Roman"/>
+          <w:sz w:val="22"/>
+          <w:szCs w:val="24"/>
+        </w:rPr>
+      </w:r>
     </w:p>
     <w:p>
       <w:pPr>
@@ -280,38 +278,48 @@
         <w:ind w:left="82"/>
         <w:jc w:val="center"/>
         <w:rPr>
+          <w:rFonts w:ascii="Times New Roman" w:hAnsi="Times New Roman" w:cs="Times New Roman"/>
           <w:b/>
           <w:color w:val="70ad47"/>
           <w:sz w:val="36"/>
+          <w:szCs w:val="24"/>
         </w:rPr>
       </w:pPr>
       <w:r>
         <w:rPr>
+          <w:rFonts w:ascii="Times New Roman" w:hAnsi="Times New Roman" w:eastAsia="Times New Roman" w:cs="Times New Roman"/>
           <w:b/>
           <w:color w:val="70ad47"/>
           <w:sz w:val="36"/>
+          <w:szCs w:val="24"/>
         </w:rPr>
       </w:r>
       <w:r>
         <w:rPr>
+          <w:rFonts w:ascii="Times New Roman" w:hAnsi="Times New Roman" w:eastAsia="Times New Roman" w:cs="Times New Roman"/>
           <w:b/>
           <w:color w:val="70ad47"/>
           <w:sz w:val="36"/>
+          <w:szCs w:val="24"/>
         </w:rPr>
         <w:t xml:space="preserve">Vom IST-Prozess zum n8n-gestützten SOLL-Prozess: Schwachstellenanalyse und prototypische Teilautomatisierung der Materialbeschaffung in einem kleinen Handwerksbetrieb</w:t>
       </w:r>
       <w:r>
         <w:rPr>
+          <w:rFonts w:ascii="Times New Roman" w:hAnsi="Times New Roman" w:eastAsia="Times New Roman" w:cs="Times New Roman"/>
           <w:b/>
           <w:color w:val="70ad47"/>
           <w:sz w:val="36"/>
+          <w:szCs w:val="24"/>
         </w:rPr>
       </w:r>
       <w:r>
         <w:rPr>
+          <w:rFonts w:ascii="Times New Roman" w:hAnsi="Times New Roman" w:eastAsia="Times New Roman" w:cs="Times New Roman"/>
           <w:b/>
           <w:color w:val="70ad47"/>
           <w:sz w:val="36"/>
+          <w:szCs w:val="24"/>
         </w:rPr>
       </w:r>
     </w:p>
@@ -322,23 +330,38 @@
         <w:ind w:left="82"/>
         <w:jc w:val="center"/>
         <w:rPr>
+          <w:rFonts w:ascii="Times New Roman" w:hAnsi="Times New Roman" w:cs="Times New Roman"/>
           <w:b/>
           <w:color w:val="70ad47"/>
           <w:sz w:val="36"/>
+          <w:szCs w:val="24"/>
         </w:rPr>
       </w:pPr>
       <w:r>
         <w:rPr>
+          <w:rFonts w:ascii="Times New Roman" w:hAnsi="Times New Roman" w:eastAsia="Times New Roman" w:cs="Times New Roman"/>
           <w:b/>
           <w:color w:val="70ad47"/>
           <w:sz w:val="36"/>
+          <w:szCs w:val="24"/>
         </w:rPr>
       </w:r>
       <w:r>
         <w:rPr>
+          <w:rFonts w:ascii="Times New Roman" w:hAnsi="Times New Roman" w:eastAsia="Times New Roman" w:cs="Times New Roman"/>
           <w:b/>
           <w:color w:val="70ad47"/>
           <w:sz w:val="36"/>
+          <w:szCs w:val="24"/>
+        </w:rPr>
+      </w:r>
+      <w:r>
+        <w:rPr>
+          <w:rFonts w:ascii="Times New Roman" w:hAnsi="Times New Roman" w:eastAsia="Times New Roman" w:cs="Times New Roman"/>
+          <w:b/>
+          <w:color w:val="70ad47"/>
+          <w:sz w:val="36"/>
+          <w:szCs w:val="24"/>
         </w:rPr>
       </w:r>
     </w:p>
@@ -348,19 +371,44 @@
         <w:spacing w:after="0"/>
         <w:ind w:left="82"/>
         <w:jc w:val="center"/>
-        <w:rPr/>
-      </w:pPr>
-      <w:r/>
-      <w:r/>
+        <w:rPr>
+          <w:rFonts w:ascii="Times New Roman" w:hAnsi="Times New Roman" w:cs="Times New Roman"/>
+          <w:sz w:val="22"/>
+          <w:szCs w:val="24"/>
+        </w:rPr>
+      </w:pPr>
+      <w:r>
+        <w:rPr>
+          <w:rFonts w:ascii="Times New Roman" w:hAnsi="Times New Roman" w:eastAsia="Times New Roman" w:cs="Times New Roman"/>
+          <w:sz w:val="22"/>
+          <w:szCs w:val="24"/>
+        </w:rPr>
+      </w:r>
+      <w:r>
+        <w:rPr>
+          <w:rFonts w:ascii="Times New Roman" w:hAnsi="Times New Roman" w:eastAsia="Times New Roman" w:cs="Times New Roman"/>
+          <w:sz w:val="22"/>
+          <w:szCs w:val="24"/>
+        </w:rPr>
+      </w:r>
     </w:p>
     <w:p>
       <w:pPr>
         <w:pBdr/>
         <w:spacing w:after="238"/>
         <w:ind w:right="-390" w:left="-390"/>
-        <w:rPr/>
+        <w:rPr>
+          <w:rFonts w:ascii="Times New Roman" w:hAnsi="Times New Roman" w:cs="Times New Roman"/>
+          <w:sz w:val="22"/>
+          <w:szCs w:val="24"/>
+        </w:rPr>
       </w:pPr>
       <w:r>
+        <w:rPr>
+          <w:rFonts w:ascii="Times New Roman" w:hAnsi="Times New Roman" w:eastAsia="Times New Roman" w:cs="Times New Roman"/>
+          <w:sz w:val="22"/>
+          <w:szCs w:val="24"/>
+        </w:rPr>
         <mc:AlternateContent>
           <mc:Choice Requires="wpg">
             <w:drawing>
@@ -457,7 +505,13 @@
           </mc:Fallback>
         </mc:AlternateContent>
       </w:r>
-      <w:r/>
+      <w:r>
+        <w:rPr>
+          <w:rFonts w:ascii="Times New Roman" w:hAnsi="Times New Roman" w:eastAsia="Times New Roman" w:cs="Times New Roman"/>
+          <w:sz w:val="22"/>
+          <w:szCs w:val="24"/>
+        </w:rPr>
+      </w:r>
     </w:p>
     <w:p>
       <w:pPr>
@@ -465,15 +519,27 @@
         <w:spacing/>
         <w:ind/>
         <w:jc w:val="center"/>
-        <w:rPr/>
+        <w:rPr>
+          <w:rFonts w:ascii="Times New Roman" w:hAnsi="Times New Roman" w:cs="Times New Roman"/>
+          <w:sz w:val="22"/>
+          <w:szCs w:val="24"/>
+        </w:rPr>
       </w:pPr>
       <w:r>
         <w:rPr>
+          <w:rFonts w:ascii="Times New Roman" w:hAnsi="Times New Roman" w:eastAsia="Times New Roman" w:cs="Times New Roman"/>
           <w:sz w:val="32"/>
+          <w:szCs w:val="24"/>
         </w:rPr>
         <w:t xml:space="preserve">Bachelorarbeit </w:t>
       </w:r>
-      <w:r/>
+      <w:r>
+        <w:rPr>
+          <w:rFonts w:ascii="Times New Roman" w:hAnsi="Times New Roman" w:eastAsia="Times New Roman" w:cs="Times New Roman"/>
+          <w:sz w:val="22"/>
+          <w:szCs w:val="24"/>
+        </w:rPr>
+      </w:r>
     </w:p>
     <w:p>
       <w:pPr>
@@ -481,15 +547,27 @@
         <w:spacing w:after="62"/>
         <w:ind w:left="74"/>
         <w:jc w:val="center"/>
-        <w:rPr/>
+        <w:rPr>
+          <w:rFonts w:ascii="Times New Roman" w:hAnsi="Times New Roman" w:cs="Times New Roman"/>
+          <w:sz w:val="22"/>
+          <w:szCs w:val="24"/>
+        </w:rPr>
       </w:pPr>
       <w:r>
         <w:rPr>
+          <w:rFonts w:ascii="Times New Roman" w:hAnsi="Times New Roman" w:eastAsia="Times New Roman" w:cs="Times New Roman"/>
           <w:sz w:val="32"/>
+          <w:szCs w:val="24"/>
         </w:rPr>
         <w:t xml:space="preserve"> </w:t>
       </w:r>
-      <w:r/>
+      <w:r>
+        <w:rPr>
+          <w:rFonts w:ascii="Times New Roman" w:hAnsi="Times New Roman" w:eastAsia="Times New Roman" w:cs="Times New Roman"/>
+          <w:sz w:val="22"/>
+          <w:szCs w:val="24"/>
+        </w:rPr>
+      </w:r>
     </w:p>
     <w:p>
       <w:pPr>
@@ -497,15 +575,27 @@
         <w:spacing w:after="164"/>
         <w:ind w:left="55"/>
         <w:jc w:val="center"/>
-        <w:rPr/>
+        <w:rPr>
+          <w:rFonts w:ascii="Times New Roman" w:hAnsi="Times New Roman" w:cs="Times New Roman"/>
+          <w:sz w:val="22"/>
+          <w:szCs w:val="24"/>
+        </w:rPr>
       </w:pPr>
       <w:r>
         <w:rPr>
+          <w:rFonts w:ascii="Times New Roman" w:hAnsi="Times New Roman" w:eastAsia="Times New Roman" w:cs="Times New Roman"/>
           <w:sz w:val="24"/>
+          <w:szCs w:val="24"/>
         </w:rPr>
         <w:t xml:space="preserve"> </w:t>
       </w:r>
-      <w:r/>
+      <w:r>
+        <w:rPr>
+          <w:rFonts w:ascii="Times New Roman" w:hAnsi="Times New Roman" w:eastAsia="Times New Roman" w:cs="Times New Roman"/>
+          <w:sz w:val="22"/>
+          <w:szCs w:val="24"/>
+        </w:rPr>
+      </w:r>
     </w:p>
     <w:p>
       <w:pPr>
@@ -513,15 +603,27 @@
         <w:spacing w:after="280"/>
         <w:ind w:right="7" w:hanging="10" w:left="10"/>
         <w:jc w:val="center"/>
-        <w:rPr/>
+        <w:rPr>
+          <w:rFonts w:ascii="Times New Roman" w:hAnsi="Times New Roman" w:cs="Times New Roman"/>
+          <w:sz w:val="22"/>
+          <w:szCs w:val="24"/>
+        </w:rPr>
       </w:pPr>
       <w:r>
         <w:rPr>
+          <w:rFonts w:ascii="Times New Roman" w:hAnsi="Times New Roman" w:eastAsia="Times New Roman" w:cs="Times New Roman"/>
           <w:sz w:val="24"/>
+          <w:szCs w:val="24"/>
         </w:rPr>
-        <w:t xml:space="preserve">Name des Studiengangs </w:t>
+        <w:t xml:space="preserve">Name des Studiengangs: </w:t>
       </w:r>
-      <w:r/>
+      <w:r>
+        <w:rPr>
+          <w:rFonts w:ascii="Times New Roman" w:hAnsi="Times New Roman" w:eastAsia="Times New Roman" w:cs="Times New Roman"/>
+          <w:sz w:val="22"/>
+          <w:szCs w:val="24"/>
+        </w:rPr>
+      </w:r>
     </w:p>
     <w:p>
       <w:pPr>
@@ -529,15 +631,27 @@
         <w:spacing w:after="163"/>
         <w:ind w:hanging="10" w:left="14"/>
         <w:jc w:val="center"/>
-        <w:rPr/>
+        <w:rPr>
+          <w:rFonts w:ascii="Times New Roman" w:hAnsi="Times New Roman" w:cs="Times New Roman"/>
+          <w:sz w:val="22"/>
+          <w:szCs w:val="24"/>
+        </w:rPr>
       </w:pPr>
       <w:r>
         <w:rPr>
+          <w:rFonts w:ascii="Times New Roman" w:hAnsi="Times New Roman" w:eastAsia="Times New Roman" w:cs="Times New Roman"/>
           <w:sz w:val="36"/>
+          <w:szCs w:val="24"/>
         </w:rPr>
         <w:t xml:space="preserve">Wirtschaftsinformatik </w:t>
       </w:r>
-      <w:r/>
+      <w:r>
+        <w:rPr>
+          <w:rFonts w:ascii="Times New Roman" w:hAnsi="Times New Roman" w:eastAsia="Times New Roman" w:cs="Times New Roman"/>
+          <w:sz w:val="22"/>
+          <w:szCs w:val="24"/>
+        </w:rPr>
+      </w:r>
     </w:p>
     <w:p>
       <w:pPr>
@@ -545,17 +659,29 @@
         <w:spacing w:after="48" w:line="250" w:lineRule="auto"/>
         <w:ind w:hanging="10" w:left="13"/>
         <w:jc w:val="center"/>
-        <w:rPr/>
+        <w:rPr>
+          <w:rFonts w:ascii="Times New Roman" w:hAnsi="Times New Roman" w:cs="Times New Roman"/>
+          <w:sz w:val="22"/>
+          <w:szCs w:val="24"/>
+        </w:rPr>
       </w:pPr>
       <w:r>
         <w:rPr>
+          <w:rFonts w:ascii="Times New Roman" w:hAnsi="Times New Roman" w:eastAsia="Times New Roman" w:cs="Times New Roman"/>
           <w:b/>
           <w:color w:val="70ad47"/>
           <w:sz w:val="36"/>
+          <w:szCs w:val="24"/>
         </w:rPr>
         <w:t xml:space="preserve">Fachbereich 4 </w:t>
       </w:r>
-      <w:r/>
+      <w:r>
+        <w:rPr>
+          <w:rFonts w:ascii="Times New Roman" w:hAnsi="Times New Roman" w:eastAsia="Times New Roman" w:cs="Times New Roman"/>
+          <w:sz w:val="22"/>
+          <w:szCs w:val="24"/>
+        </w:rPr>
+      </w:r>
     </w:p>
     <w:p>
       <w:pPr>
@@ -563,15 +689,27 @@
         <w:spacing w:after="280"/>
         <w:ind w:right="10" w:hanging="10" w:left="10"/>
         <w:jc w:val="center"/>
-        <w:rPr/>
+        <w:rPr>
+          <w:rFonts w:ascii="Times New Roman" w:hAnsi="Times New Roman" w:cs="Times New Roman"/>
+          <w:sz w:val="22"/>
+          <w:szCs w:val="24"/>
+        </w:rPr>
       </w:pPr>
       <w:r>
         <w:rPr>
+          <w:rFonts w:ascii="Times New Roman" w:hAnsi="Times New Roman" w:eastAsia="Times New Roman" w:cs="Times New Roman"/>
           <w:sz w:val="24"/>
+          <w:szCs w:val="24"/>
         </w:rPr>
-        <w:t xml:space="preserve">vorgelegt von </w:t>
+        <w:t xml:space="preserve">vorgelegt von: </w:t>
       </w:r>
-      <w:r/>
+      <w:r>
+        <w:rPr>
+          <w:rFonts w:ascii="Times New Roman" w:hAnsi="Times New Roman" w:eastAsia="Times New Roman" w:cs="Times New Roman"/>
+          <w:sz w:val="22"/>
+          <w:szCs w:val="24"/>
+        </w:rPr>
+      </w:r>
     </w:p>
     <w:p>
       <w:pPr>
@@ -579,15 +717,27 @@
         <w:spacing w:after="125"/>
         <w:ind w:right="20" w:hanging="10" w:left="14"/>
         <w:jc w:val="center"/>
-        <w:rPr/>
+        <w:rPr>
+          <w:rFonts w:ascii="Times New Roman" w:hAnsi="Times New Roman" w:cs="Times New Roman"/>
+          <w:sz w:val="22"/>
+          <w:szCs w:val="24"/>
+        </w:rPr>
       </w:pPr>
       <w:r>
         <w:rPr>
+          <w:rFonts w:ascii="Times New Roman" w:hAnsi="Times New Roman" w:eastAsia="Times New Roman" w:cs="Times New Roman"/>
           <w:sz w:val="36"/>
+          <w:szCs w:val="24"/>
         </w:rPr>
         <w:t xml:space="preserve">Cedric Jon Arnhold </w:t>
       </w:r>
-      <w:r/>
+      <w:r>
+        <w:rPr>
+          <w:rFonts w:ascii="Times New Roman" w:hAnsi="Times New Roman" w:eastAsia="Times New Roman" w:cs="Times New Roman"/>
+          <w:sz w:val="22"/>
+          <w:szCs w:val="24"/>
+        </w:rPr>
+      </w:r>
     </w:p>
     <w:p>
       <w:pPr>
@@ -595,30 +745,54 @@
         <w:spacing w:after="70"/>
         <w:ind w:left="74"/>
         <w:jc w:val="center"/>
-        <w:rPr/>
+        <w:rPr>
+          <w:rFonts w:ascii="Times New Roman" w:hAnsi="Times New Roman" w:cs="Times New Roman"/>
+          <w:sz w:val="22"/>
+          <w:szCs w:val="24"/>
+        </w:rPr>
       </w:pPr>
       <w:r>
         <w:rPr>
+          <w:rFonts w:ascii="Times New Roman" w:hAnsi="Times New Roman" w:eastAsia="Times New Roman" w:cs="Times New Roman"/>
           <w:sz w:val="32"/>
+          <w:szCs w:val="24"/>
         </w:rPr>
         <w:t xml:space="preserve"> </w:t>
       </w:r>
-      <w:r/>
+      <w:r>
+        <w:rPr>
+          <w:rFonts w:ascii="Times New Roman" w:hAnsi="Times New Roman" w:eastAsia="Times New Roman" w:cs="Times New Roman"/>
+          <w:sz w:val="22"/>
+          <w:szCs w:val="24"/>
+        </w:rPr>
+      </w:r>
     </w:p>
     <w:p>
       <w:pPr>
         <w:pBdr/>
         <w:spacing w:after="8" w:line="387" w:lineRule="auto"/>
         <w:ind w:right="4125" w:left="4181"/>
-        <w:rPr/>
+        <w:rPr>
+          <w:rFonts w:ascii="Times New Roman" w:hAnsi="Times New Roman" w:cs="Times New Roman"/>
+          <w:sz w:val="22"/>
+          <w:szCs w:val="24"/>
+        </w:rPr>
       </w:pPr>
       <w:r>
         <w:rPr>
+          <w:rFonts w:ascii="Times New Roman" w:hAnsi="Times New Roman" w:eastAsia="Times New Roman" w:cs="Times New Roman"/>
           <w:sz w:val="24"/>
+          <w:szCs w:val="24"/>
         </w:rPr>
         <w:t xml:space="preserve">  </w:t>
       </w:r>
-      <w:r/>
+      <w:r>
+        <w:rPr>
+          <w:rFonts w:ascii="Times New Roman" w:hAnsi="Times New Roman" w:eastAsia="Times New Roman" w:cs="Times New Roman"/>
+          <w:sz w:val="22"/>
+          <w:szCs w:val="24"/>
+        </w:rPr>
+      </w:r>
     </w:p>
     <w:p>
       <w:pPr>
@@ -626,15 +800,27 @@
         <w:spacing w:after="201"/>
         <w:ind w:right="4" w:hanging="10" w:left="10"/>
         <w:jc w:val="center"/>
-        <w:rPr/>
+        <w:rPr>
+          <w:rFonts w:ascii="Times New Roman" w:hAnsi="Times New Roman" w:cs="Times New Roman"/>
+          <w:sz w:val="22"/>
+          <w:szCs w:val="24"/>
+        </w:rPr>
       </w:pPr>
       <w:r>
         <w:rPr>
+          <w:rFonts w:ascii="Times New Roman" w:hAnsi="Times New Roman" w:eastAsia="Times New Roman" w:cs="Times New Roman"/>
           <w:sz w:val="24"/>
+          <w:szCs w:val="24"/>
         </w:rPr>
         <w:t xml:space="preserve">Datum: </w:t>
       </w:r>
-      <w:r/>
+      <w:r>
+        <w:rPr>
+          <w:rFonts w:ascii="Times New Roman" w:hAnsi="Times New Roman" w:eastAsia="Times New Roman" w:cs="Times New Roman"/>
+          <w:sz w:val="22"/>
+          <w:szCs w:val="24"/>
+        </w:rPr>
+      </w:r>
     </w:p>
     <w:p>
       <w:pPr>
@@ -642,15 +828,27 @@
         <w:spacing w:after="212"/>
         <w:ind w:right="20"/>
         <w:jc w:val="center"/>
-        <w:rPr/>
+        <w:rPr>
+          <w:rFonts w:ascii="Times New Roman" w:hAnsi="Times New Roman" w:cs="Times New Roman"/>
+          <w:sz w:val="22"/>
+          <w:szCs w:val="24"/>
+        </w:rPr>
       </w:pPr>
       <w:r>
         <w:rPr>
+          <w:rFonts w:ascii="Times New Roman" w:hAnsi="Times New Roman" w:eastAsia="Times New Roman" w:cs="Times New Roman"/>
           <w:sz w:val="28"/>
+          <w:szCs w:val="24"/>
         </w:rPr>
-        <w:t xml:space="preserve">Berlin, TT.MM.JJJJ </w:t>
+        <w:t xml:space="preserve">Berlin, 01.08.2026 </w:t>
       </w:r>
-      <w:r/>
+      <w:r>
+        <w:rPr>
+          <w:rFonts w:ascii="Times New Roman" w:hAnsi="Times New Roman" w:eastAsia="Times New Roman" w:cs="Times New Roman"/>
+          <w:sz w:val="22"/>
+          <w:szCs w:val="24"/>
+        </w:rPr>
+      </w:r>
     </w:p>
     <w:p>
       <w:pPr>
@@ -658,15 +856,27 @@
         <w:spacing w:after="182"/>
         <w:ind w:left="74"/>
         <w:jc w:val="center"/>
-        <w:rPr/>
+        <w:rPr>
+          <w:rFonts w:ascii="Times New Roman" w:hAnsi="Times New Roman" w:cs="Times New Roman"/>
+          <w:sz w:val="20"/>
+          <w:szCs w:val="22"/>
+        </w:rPr>
       </w:pPr>
       <w:r>
         <w:rPr>
-          <w:sz w:val="32"/>
+          <w:rFonts w:ascii="Times New Roman" w:hAnsi="Times New Roman" w:eastAsia="Times New Roman" w:cs="Times New Roman"/>
+          <w:sz w:val="28"/>
+          <w:szCs w:val="22"/>
         </w:rPr>
         <w:t xml:space="preserve"> </w:t>
       </w:r>
-      <w:r/>
+      <w:r>
+        <w:rPr>
+          <w:rFonts w:ascii="Times New Roman" w:hAnsi="Times New Roman" w:eastAsia="Times New Roman" w:cs="Times New Roman"/>
+          <w:sz w:val="20"/>
+          <w:szCs w:val="22"/>
+        </w:rPr>
+      </w:r>
     </w:p>
     <w:p>
       <w:pPr>
@@ -674,42 +884,78 @@
         <w:spacing w:after="163"/>
         <w:ind w:right="10" w:hanging="10" w:left="14"/>
         <w:jc w:val="center"/>
-        <w:rPr/>
+        <w:rPr>
+          <w:rFonts w:ascii="Times New Roman" w:hAnsi="Times New Roman" w:cs="Times New Roman"/>
+          <w:sz w:val="20"/>
+          <w:szCs w:val="22"/>
+        </w:rPr>
       </w:pPr>
       <w:r>
         <w:rPr>
-          <w:sz w:val="36"/>
+          <w:rFonts w:ascii="Times New Roman" w:hAnsi="Times New Roman" w:eastAsia="Times New Roman" w:cs="Times New Roman"/>
+          <w:sz w:val="32"/>
+          <w:szCs w:val="22"/>
         </w:rPr>
         <w:t xml:space="preserve">Erstgutachter*in:  Prof. Dr. Verena Majuntke </w:t>
       </w:r>
-      <w:r/>
+      <w:r>
+        <w:rPr>
+          <w:rFonts w:ascii="Times New Roman" w:hAnsi="Times New Roman" w:eastAsia="Times New Roman" w:cs="Times New Roman"/>
+          <w:sz w:val="20"/>
+          <w:szCs w:val="22"/>
+        </w:rPr>
+      </w:r>
     </w:p>
     <w:p>
       <w:pPr>
         <w:pBdr/>
         <w:spacing w:after="0"/>
         <w:ind/>
-        <w:rPr/>
+        <w:rPr>
+          <w:rFonts w:ascii="Times New Roman" w:hAnsi="Times New Roman" w:cs="Times New Roman"/>
+          <w:sz w:val="22"/>
+          <w:szCs w:val="24"/>
+        </w:rPr>
       </w:pPr>
       <w:r>
         <w:rPr>
-          <w:sz w:val="36"/>
+          <w:rFonts w:ascii="Times New Roman" w:hAnsi="Times New Roman" w:eastAsia="Times New Roman" w:cs="Times New Roman"/>
+          <w:sz w:val="32"/>
+          <w:szCs w:val="22"/>
         </w:rPr>
         <w:t xml:space="preserve">Zweitgutachter*in: Prof. Dr.-Ing. Timo </w:t>
       </w:r>
       <w:r>
         <w:rPr>
-          <w:sz w:val="36"/>
+          <w:rFonts w:ascii="Times New Roman" w:hAnsi="Times New Roman" w:eastAsia="Times New Roman" w:cs="Times New Roman"/>
+          <w:sz w:val="32"/>
+          <w:szCs w:val="22"/>
         </w:rPr>
         <w:t xml:space="preserve">Fleschutz</w:t>
       </w:r>
       <w:r>
         <w:rPr>
+          <w:rFonts w:ascii="Times New Roman" w:hAnsi="Times New Roman" w:eastAsia="Times New Roman" w:cs="Times New Roman"/>
+          <w:sz w:val="32"/>
+          <w:szCs w:val="22"/>
+        </w:rPr>
+        <w:t xml:space="preserve">-Balarezo  </w:t>
+      </w:r>
+      <w:r>
+        <w:rPr>
+          <w:rFonts w:ascii="Times New Roman" w:hAnsi="Times New Roman" w:eastAsia="Times New Roman" w:cs="Times New Roman"/>
           <w:sz w:val="36"/>
+          <w:szCs w:val="24"/>
         </w:rPr>
-        <w:t xml:space="preserve">-Balarezo   </w:t>
+        <w:t xml:space="preserve"> </w:t>
       </w:r>
-      <w:r/>
+      <w:r>
+        <w:rPr>
+          <w:rFonts w:ascii="Times New Roman" w:hAnsi="Times New Roman" w:eastAsia="Times New Roman" w:cs="Times New Roman"/>
+          <w:sz w:val="22"/>
+          <w:szCs w:val="24"/>
+        </w:rPr>
+      </w:r>
     </w:p>
     <w:sectPr>
       <w:footnotePr/>
@@ -733,7 +979,6 @@
         <w:ind/>
         <w:rPr/>
       </w:pPr>
-      <w:r/>
       <w:r>
         <w:separator/>
       </w:r>
@@ -748,7 +993,6 @@
         <w:ind/>
         <w:rPr/>
       </w:pPr>
-      <w:r/>
       <w:r>
         <w:continuationSeparator/>
       </w:r>
@@ -768,7 +1012,6 @@
         <w:ind/>
         <w:rPr/>
       </w:pPr>
-      <w:r/>
       <w:r>
         <w:separator/>
       </w:r>
@@ -783,7 +1026,6 @@
         <w:ind/>
         <w:rPr/>
       </w:pPr>
-      <w:r/>
       <w:r>
         <w:continuationSeparator/>
       </w:r>
@@ -952,9 +1194,9 @@
     <w:lsdException w:name="Bibliography" w:uiPriority="37"/>
     <w:lsdException w:name="TOC Heading" w:uiPriority="39" w:qFormat="1"/>
   </w:latentStyles>
-  <w:style w:type="table" w:styleId="12">
+  <w:style w:type="table" w:styleId="701">
     <w:name w:val="Table Grid"/>
-    <w:basedOn w:val="666"/>
+    <w:basedOn w:val="889"/>
     <w:uiPriority w:val="59"/>
     <w:pPr>
       <w:pBdr/>
@@ -1151,9 +1393,9 @@
       </w:tcPr>
     </w:tblStylePr>
   </w:style>
-  <w:style w:type="table" w:styleId="13">
+  <w:style w:type="table" w:styleId="702">
     <w:name w:val="Table Grid Light"/>
-    <w:basedOn w:val="666"/>
+    <w:basedOn w:val="889"/>
     <w:uiPriority w:val="59"/>
     <w:pPr>
       <w:pBdr/>
@@ -1350,9 +1592,9 @@
       </w:tcPr>
     </w:tblStylePr>
   </w:style>
-  <w:style w:type="table" w:styleId="14">
+  <w:style w:type="table" w:styleId="703">
     <w:name w:val="Plain Table 1"/>
-    <w:basedOn w:val="666"/>
+    <w:basedOn w:val="889"/>
     <w:uiPriority w:val="59"/>
     <w:pPr>
       <w:pBdr/>
@@ -1575,9 +1817,9 @@
       </w:tcPr>
     </w:tblStylePr>
   </w:style>
-  <w:style w:type="table" w:styleId="15">
+  <w:style w:type="table" w:styleId="704">
     <w:name w:val="Plain Table 2"/>
-    <w:basedOn w:val="666"/>
+    <w:basedOn w:val="889"/>
     <w:uiPriority w:val="59"/>
     <w:pPr>
       <w:pBdr/>
@@ -1808,9 +2050,9 @@
       </w:tcPr>
     </w:tblStylePr>
   </w:style>
-  <w:style w:type="table" w:styleId="16">
+  <w:style w:type="table" w:styleId="705">
     <w:name w:val="Plain Table 3"/>
-    <w:basedOn w:val="666"/>
+    <w:basedOn w:val="889"/>
     <w:uiPriority w:val="99"/>
     <w:pPr>
       <w:pBdr/>
@@ -2038,9 +2280,9 @@
       </w:tcPr>
     </w:tblStylePr>
   </w:style>
-  <w:style w:type="table" w:styleId="17">
+  <w:style w:type="table" w:styleId="706">
     <w:name w:val="Plain Table 4"/>
-    <w:basedOn w:val="666"/>
+    <w:basedOn w:val="889"/>
     <w:uiPriority w:val="99"/>
     <w:pPr>
       <w:pBdr/>
@@ -2254,9 +2496,9 @@
       </w:tcPr>
     </w:tblStylePr>
   </w:style>
-  <w:style w:type="table" w:styleId="18">
+  <w:style w:type="table" w:styleId="707">
     <w:name w:val="Plain Table 5"/>
-    <w:basedOn w:val="666"/>
+    <w:basedOn w:val="889"/>
     <w:uiPriority w:val="99"/>
     <w:pPr>
       <w:pBdr/>
@@ -2487,9 +2729,9 @@
       </w:tcPr>
     </w:tblStylePr>
   </w:style>
-  <w:style w:type="table" w:styleId="19">
+  <w:style w:type="table" w:styleId="708">
     <w:name w:val="Grid Table 1 Light"/>
-    <w:basedOn w:val="666"/>
+    <w:basedOn w:val="889"/>
     <w:uiPriority w:val="99"/>
     <w:pPr>
       <w:pBdr/>
@@ -2710,9 +2952,9 @@
       </w:tcPr>
     </w:tblStylePr>
   </w:style>
-  <w:style w:type="table" w:styleId="20">
+  <w:style w:type="table" w:styleId="709">
     <w:name w:val="Grid Table 1 Light - Accent 1"/>
-    <w:basedOn w:val="666"/>
+    <w:basedOn w:val="889"/>
     <w:uiPriority w:val="99"/>
     <w:pPr>
       <w:pBdr/>
@@ -2933,9 +3175,9 @@
       </w:tcPr>
     </w:tblStylePr>
   </w:style>
-  <w:style w:type="table" w:styleId="21">
+  <w:style w:type="table" w:styleId="710">
     <w:name w:val="Grid Table 1 Light - Accent 2"/>
-    <w:basedOn w:val="666"/>
+    <w:basedOn w:val="889"/>
     <w:uiPriority w:val="99"/>
     <w:pPr>
       <w:pBdr/>
@@ -3156,9 +3398,9 @@
       </w:tcPr>
     </w:tblStylePr>
   </w:style>
-  <w:style w:type="table" w:styleId="22">
+  <w:style w:type="table" w:styleId="711">
     <w:name w:val="Grid Table 1 Light - Accent 3"/>
-    <w:basedOn w:val="666"/>
+    <w:basedOn w:val="889"/>
     <w:uiPriority w:val="99"/>
     <w:pPr>
       <w:pBdr/>
@@ -3379,9 +3621,9 @@
       </w:tcPr>
     </w:tblStylePr>
   </w:style>
-  <w:style w:type="table" w:styleId="23">
+  <w:style w:type="table" w:styleId="712">
     <w:name w:val="Grid Table 1 Light - Accent 4"/>
-    <w:basedOn w:val="666"/>
+    <w:basedOn w:val="889"/>
     <w:uiPriority w:val="99"/>
     <w:pPr>
       <w:pBdr/>
@@ -3602,9 +3844,9 @@
       </w:tcPr>
     </w:tblStylePr>
   </w:style>
-  <w:style w:type="table" w:styleId="24">
+  <w:style w:type="table" w:styleId="713">
     <w:name w:val="Grid Table 1 Light - Accent 5"/>
-    <w:basedOn w:val="666"/>
+    <w:basedOn w:val="889"/>
     <w:uiPriority w:val="99"/>
     <w:pPr>
       <w:pBdr/>
@@ -3825,9 +4067,9 @@
       </w:tcPr>
     </w:tblStylePr>
   </w:style>
-  <w:style w:type="table" w:styleId="25">
+  <w:style w:type="table" w:styleId="714">
     <w:name w:val="Grid Table 1 Light - Accent 6"/>
-    <w:basedOn w:val="666"/>
+    <w:basedOn w:val="889"/>
     <w:uiPriority w:val="99"/>
     <w:pPr>
       <w:pBdr/>
@@ -4048,9 +4290,9 @@
       </w:tcPr>
     </w:tblStylePr>
   </w:style>
-  <w:style w:type="table" w:styleId="26">
+  <w:style w:type="table" w:styleId="715">
     <w:name w:val="Grid Table 2"/>
-    <w:basedOn w:val="666"/>
+    <w:basedOn w:val="889"/>
     <w:uiPriority w:val="99"/>
     <w:pPr>
       <w:pBdr/>
@@ -4280,9 +4522,9 @@
       </w:tcPr>
     </w:tblStylePr>
   </w:style>
-  <w:style w:type="table" w:styleId="27">
+  <w:style w:type="table" w:styleId="716">
     <w:name w:val="Grid Table 2 - Accent 1"/>
-    <w:basedOn w:val="666"/>
+    <w:basedOn w:val="889"/>
     <w:uiPriority w:val="99"/>
     <w:pPr>
       <w:pBdr/>
@@ -4512,9 +4754,9 @@
       </w:tcPr>
     </w:tblStylePr>
   </w:style>
-  <w:style w:type="table" w:styleId="28">
+  <w:style w:type="table" w:styleId="717">
     <w:name w:val="Grid Table 2 - Accent 2"/>
-    <w:basedOn w:val="666"/>
+    <w:basedOn w:val="889"/>
     <w:uiPriority w:val="99"/>
     <w:pPr>
       <w:pBdr/>
@@ -4744,9 +4986,9 @@
       </w:tcPr>
     </w:tblStylePr>
   </w:style>
-  <w:style w:type="table" w:styleId="29">
+  <w:style w:type="table" w:styleId="718">
     <w:name w:val="Grid Table 2 - Accent 3"/>
-    <w:basedOn w:val="666"/>
+    <w:basedOn w:val="889"/>
     <w:uiPriority w:val="99"/>
     <w:pPr>
       <w:pBdr/>
@@ -4976,9 +5218,9 @@
       </w:tcPr>
     </w:tblStylePr>
   </w:style>
-  <w:style w:type="table" w:styleId="30">
+  <w:style w:type="table" w:styleId="719">
     <w:name w:val="Grid Table 2 - Accent 4"/>
-    <w:basedOn w:val="666"/>
+    <w:basedOn w:val="889"/>
     <w:uiPriority w:val="99"/>
     <w:pPr>
       <w:pBdr/>
@@ -5208,9 +5450,9 @@
       </w:tcPr>
     </w:tblStylePr>
   </w:style>
-  <w:style w:type="table" w:styleId="31">
+  <w:style w:type="table" w:styleId="720">
     <w:name w:val="Grid Table 2 - Accent 5"/>
-    <w:basedOn w:val="666"/>
+    <w:basedOn w:val="889"/>
     <w:uiPriority w:val="99"/>
     <w:pPr>
       <w:pBdr/>
@@ -5440,9 +5682,9 @@
       </w:tcPr>
     </w:tblStylePr>
   </w:style>
-  <w:style w:type="table" w:styleId="32">
+  <w:style w:type="table" w:styleId="721">
     <w:name w:val="Grid Table 2 - Accent 6"/>
-    <w:basedOn w:val="666"/>
+    <w:basedOn w:val="889"/>
     <w:uiPriority w:val="99"/>
     <w:pPr>
       <w:pBdr/>
@@ -5672,9 +5914,9 @@
       </w:tcPr>
     </w:tblStylePr>
   </w:style>
-  <w:style w:type="table" w:styleId="33">
+  <w:style w:type="table" w:styleId="722">
     <w:name w:val="Grid Table 3"/>
-    <w:basedOn w:val="666"/>
+    <w:basedOn w:val="889"/>
     <w:uiPriority w:val="99"/>
     <w:pPr>
       <w:pBdr/>
@@ -5773,29 +6015,6 @@
         <w:tblBorders/>
       </w:tblPr>
       <w:tcPr>
-        <w:shd w:color="ffffff"/>
-        <w:tcBorders>
-          <w:top w:val="none" w:color="000000" w:sz="4" w:space="0"/>
-          <w:left w:val="none" w:color="000000" w:sz="4" w:space="0"/>
-          <w:bottom w:val="none" w:color="000000" w:sz="4" w:space="0"/>
-          <w:right w:val="none" w:color="000000" w:sz="4" w:space="0"/>
-        </w:tcBorders>
-      </w:tcPr>
-    </w:tblStylePr>
-    <w:tblStylePr w:type="firstRow">
-      <w:rPr>
-        <w:b/>
-        <w:color w:val="404040"/>
-      </w:rPr>
-      <w:pPr>
-        <w:pBdr/>
-        <w:spacing/>
-        <w:ind/>
-      </w:pPr>
-      <w:tblPr>
-        <w:tblBorders/>
-      </w:tblPr>
-      <w:tcPr>
         <w:shd w:val="clear" w:color="ffffff"/>
         <w:tcBorders>
           <w:top w:val="none" w:color="000000" w:sz="4" w:space="0"/>
@@ -5805,30 +6024,7 @@
         </w:tcBorders>
       </w:tcPr>
     </w:tblStylePr>
-    <w:tblStylePr w:type="lastCol">
-      <w:rPr>
-        <w:i/>
-        <w:color w:val="404040"/>
-      </w:rPr>
-      <w:pPr>
-        <w:pBdr/>
-        <w:spacing/>
-        <w:ind/>
-      </w:pPr>
-      <w:tblPr>
-        <w:tblBorders/>
-      </w:tblPr>
-      <w:tcPr>
-        <w:shd w:color="ffffff"/>
-        <w:tcBorders>
-          <w:top w:val="none" w:color="000000" w:sz="4" w:space="0"/>
-          <w:left w:val="none" w:color="000000" w:sz="4" w:space="0"/>
-          <w:bottom w:val="none" w:color="000000" w:sz="4" w:space="0"/>
-          <w:right w:val="none" w:color="000000" w:sz="4" w:space="0"/>
-        </w:tcBorders>
-      </w:tcPr>
-    </w:tblStylePr>
-    <w:tblStylePr w:type="lastRow">
+    <w:tblStylePr w:type="firstRow">
       <w:rPr>
         <w:b/>
         <w:color w:val="404040"/>
@@ -5851,6 +6047,52 @@
         </w:tcBorders>
       </w:tcPr>
     </w:tblStylePr>
+    <w:tblStylePr w:type="lastCol">
+      <w:rPr>
+        <w:i/>
+        <w:color w:val="404040"/>
+      </w:rPr>
+      <w:pPr>
+        <w:pBdr/>
+        <w:spacing/>
+        <w:ind/>
+      </w:pPr>
+      <w:tblPr>
+        <w:tblBorders/>
+      </w:tblPr>
+      <w:tcPr>
+        <w:shd w:val="clear" w:color="ffffff"/>
+        <w:tcBorders>
+          <w:top w:val="none" w:color="000000" w:sz="4" w:space="0"/>
+          <w:left w:val="none" w:color="000000" w:sz="4" w:space="0"/>
+          <w:bottom w:val="none" w:color="000000" w:sz="4" w:space="0"/>
+          <w:right w:val="none" w:color="000000" w:sz="4" w:space="0"/>
+        </w:tcBorders>
+      </w:tcPr>
+    </w:tblStylePr>
+    <w:tblStylePr w:type="lastRow">
+      <w:rPr>
+        <w:b/>
+        <w:color w:val="404040"/>
+      </w:rPr>
+      <w:pPr>
+        <w:pBdr/>
+        <w:spacing/>
+        <w:ind/>
+      </w:pPr>
+      <w:tblPr>
+        <w:tblBorders/>
+      </w:tblPr>
+      <w:tcPr>
+        <w:shd w:val="clear" w:color="ffffff"/>
+        <w:tcBorders>
+          <w:top w:val="none" w:color="000000" w:sz="4" w:space="0"/>
+          <w:left w:val="none" w:color="000000" w:sz="4" w:space="0"/>
+          <w:bottom w:val="none" w:color="000000" w:sz="4" w:space="0"/>
+          <w:right w:val="none" w:color="000000" w:sz="4" w:space="0"/>
+        </w:tcBorders>
+      </w:tcPr>
+    </w:tblStylePr>
     <w:tblStylePr w:type="nwCell">
       <w:pPr>
         <w:pBdr/>
@@ -5917,9 +6159,9 @@
       </w:tcPr>
     </w:tblStylePr>
   </w:style>
-  <w:style w:type="table" w:styleId="34">
+  <w:style w:type="table" w:styleId="723">
     <w:name w:val="Grid Table 3 - Accent 1"/>
-    <w:basedOn w:val="666"/>
+    <w:basedOn w:val="889"/>
     <w:uiPriority w:val="99"/>
     <w:pPr>
       <w:pBdr/>
@@ -6018,29 +6260,6 @@
         <w:tblBorders/>
       </w:tblPr>
       <w:tcPr>
-        <w:shd w:color="ffffff"/>
-        <w:tcBorders>
-          <w:top w:val="none" w:color="000000" w:sz="4" w:space="0"/>
-          <w:left w:val="none" w:color="000000" w:sz="4" w:space="0"/>
-          <w:bottom w:val="none" w:color="000000" w:sz="4" w:space="0"/>
-          <w:right w:val="none" w:color="000000" w:sz="4" w:space="0"/>
-        </w:tcBorders>
-      </w:tcPr>
-    </w:tblStylePr>
-    <w:tblStylePr w:type="firstRow">
-      <w:rPr>
-        <w:b/>
-        <w:color w:val="404040"/>
-      </w:rPr>
-      <w:pPr>
-        <w:pBdr/>
-        <w:spacing/>
-        <w:ind/>
-      </w:pPr>
-      <w:tblPr>
-        <w:tblBorders/>
-      </w:tblPr>
-      <w:tcPr>
         <w:shd w:val="clear" w:color="ffffff"/>
         <w:tcBorders>
           <w:top w:val="none" w:color="000000" w:sz="4" w:space="0"/>
@@ -6050,30 +6269,7 @@
         </w:tcBorders>
       </w:tcPr>
     </w:tblStylePr>
-    <w:tblStylePr w:type="lastCol">
-      <w:rPr>
-        <w:i/>
-        <w:color w:val="404040"/>
-      </w:rPr>
-      <w:pPr>
-        <w:pBdr/>
-        <w:spacing/>
-        <w:ind/>
-      </w:pPr>
-      <w:tblPr>
-        <w:tblBorders/>
-      </w:tblPr>
-      <w:tcPr>
-        <w:shd w:color="ffffff"/>
-        <w:tcBorders>
-          <w:top w:val="none" w:color="000000" w:sz="4" w:space="0"/>
-          <w:left w:val="none" w:color="000000" w:sz="4" w:space="0"/>
-          <w:bottom w:val="none" w:color="000000" w:sz="4" w:space="0"/>
-          <w:right w:val="none" w:color="000000" w:sz="4" w:space="0"/>
-        </w:tcBorders>
-      </w:tcPr>
-    </w:tblStylePr>
-    <w:tblStylePr w:type="lastRow">
+    <w:tblStylePr w:type="firstRow">
       <w:rPr>
         <w:b/>
         <w:color w:val="404040"/>
@@ -6096,6 +6292,52 @@
         </w:tcBorders>
       </w:tcPr>
     </w:tblStylePr>
+    <w:tblStylePr w:type="lastCol">
+      <w:rPr>
+        <w:i/>
+        <w:color w:val="404040"/>
+      </w:rPr>
+      <w:pPr>
+        <w:pBdr/>
+        <w:spacing/>
+        <w:ind/>
+      </w:pPr>
+      <w:tblPr>
+        <w:tblBorders/>
+      </w:tblPr>
+      <w:tcPr>
+        <w:shd w:val="clear" w:color="ffffff"/>
+        <w:tcBorders>
+          <w:top w:val="none" w:color="000000" w:sz="4" w:space="0"/>
+          <w:left w:val="none" w:color="000000" w:sz="4" w:space="0"/>
+          <w:bottom w:val="none" w:color="000000" w:sz="4" w:space="0"/>
+          <w:right w:val="none" w:color="000000" w:sz="4" w:space="0"/>
+        </w:tcBorders>
+      </w:tcPr>
+    </w:tblStylePr>
+    <w:tblStylePr w:type="lastRow">
+      <w:rPr>
+        <w:b/>
+        <w:color w:val="404040"/>
+      </w:rPr>
+      <w:pPr>
+        <w:pBdr/>
+        <w:spacing/>
+        <w:ind/>
+      </w:pPr>
+      <w:tblPr>
+        <w:tblBorders/>
+      </w:tblPr>
+      <w:tcPr>
+        <w:shd w:val="clear" w:color="ffffff"/>
+        <w:tcBorders>
+          <w:top w:val="none" w:color="000000" w:sz="4" w:space="0"/>
+          <w:left w:val="none" w:color="000000" w:sz="4" w:space="0"/>
+          <w:bottom w:val="none" w:color="000000" w:sz="4" w:space="0"/>
+          <w:right w:val="none" w:color="000000" w:sz="4" w:space="0"/>
+        </w:tcBorders>
+      </w:tcPr>
+    </w:tblStylePr>
     <w:tblStylePr w:type="nwCell">
       <w:pPr>
         <w:pBdr/>
@@ -6162,9 +6404,9 @@
       </w:tcPr>
     </w:tblStylePr>
   </w:style>
-  <w:style w:type="table" w:styleId="35">
+  <w:style w:type="table" w:styleId="724">
     <w:name w:val="Grid Table 3 - Accent 2"/>
-    <w:basedOn w:val="666"/>
+    <w:basedOn w:val="889"/>
     <w:uiPriority w:val="99"/>
     <w:pPr>
       <w:pBdr/>
@@ -6263,29 +6505,6 @@
         <w:tblBorders/>
       </w:tblPr>
       <w:tcPr>
-        <w:shd w:color="ffffff"/>
-        <w:tcBorders>
-          <w:top w:val="none" w:color="000000" w:sz="4" w:space="0"/>
-          <w:left w:val="none" w:color="000000" w:sz="4" w:space="0"/>
-          <w:bottom w:val="none" w:color="000000" w:sz="4" w:space="0"/>
-          <w:right w:val="none" w:color="000000" w:sz="4" w:space="0"/>
-        </w:tcBorders>
-      </w:tcPr>
-    </w:tblStylePr>
-    <w:tblStylePr w:type="firstRow">
-      <w:rPr>
-        <w:b/>
-        <w:color w:val="404040"/>
-      </w:rPr>
-      <w:pPr>
-        <w:pBdr/>
-        <w:spacing/>
-        <w:ind/>
-      </w:pPr>
-      <w:tblPr>
-        <w:tblBorders/>
-      </w:tblPr>
-      <w:tcPr>
         <w:shd w:val="clear" w:color="ffffff"/>
         <w:tcBorders>
           <w:top w:val="none" w:color="000000" w:sz="4" w:space="0"/>
@@ -6295,30 +6514,7 @@
         </w:tcBorders>
       </w:tcPr>
     </w:tblStylePr>
-    <w:tblStylePr w:type="lastCol">
-      <w:rPr>
-        <w:i/>
-        <w:color w:val="404040"/>
-      </w:rPr>
-      <w:pPr>
-        <w:pBdr/>
-        <w:spacing/>
-        <w:ind/>
-      </w:pPr>
-      <w:tblPr>
-        <w:tblBorders/>
-      </w:tblPr>
-      <w:tcPr>
-        <w:shd w:color="ffffff"/>
-        <w:tcBorders>
-          <w:top w:val="none" w:color="000000" w:sz="4" w:space="0"/>
-          <w:left w:val="none" w:color="000000" w:sz="4" w:space="0"/>
-          <w:bottom w:val="none" w:color="000000" w:sz="4" w:space="0"/>
-          <w:right w:val="none" w:color="000000" w:sz="4" w:space="0"/>
-        </w:tcBorders>
-      </w:tcPr>
-    </w:tblStylePr>
-    <w:tblStylePr w:type="lastRow">
+    <w:tblStylePr w:type="firstRow">
       <w:rPr>
         <w:b/>
         <w:color w:val="404040"/>
@@ -6341,6 +6537,52 @@
         </w:tcBorders>
       </w:tcPr>
     </w:tblStylePr>
+    <w:tblStylePr w:type="lastCol">
+      <w:rPr>
+        <w:i/>
+        <w:color w:val="404040"/>
+      </w:rPr>
+      <w:pPr>
+        <w:pBdr/>
+        <w:spacing/>
+        <w:ind/>
+      </w:pPr>
+      <w:tblPr>
+        <w:tblBorders/>
+      </w:tblPr>
+      <w:tcPr>
+        <w:shd w:val="clear" w:color="ffffff"/>
+        <w:tcBorders>
+          <w:top w:val="none" w:color="000000" w:sz="4" w:space="0"/>
+          <w:left w:val="none" w:color="000000" w:sz="4" w:space="0"/>
+          <w:bottom w:val="none" w:color="000000" w:sz="4" w:space="0"/>
+          <w:right w:val="none" w:color="000000" w:sz="4" w:space="0"/>
+        </w:tcBorders>
+      </w:tcPr>
+    </w:tblStylePr>
+    <w:tblStylePr w:type="lastRow">
+      <w:rPr>
+        <w:b/>
+        <w:color w:val="404040"/>
+      </w:rPr>
+      <w:pPr>
+        <w:pBdr/>
+        <w:spacing/>
+        <w:ind/>
+      </w:pPr>
+      <w:tblPr>
+        <w:tblBorders/>
+      </w:tblPr>
+      <w:tcPr>
+        <w:shd w:val="clear" w:color="ffffff"/>
+        <w:tcBorders>
+          <w:top w:val="none" w:color="000000" w:sz="4" w:space="0"/>
+          <w:left w:val="none" w:color="000000" w:sz="4" w:space="0"/>
+          <w:bottom w:val="none" w:color="000000" w:sz="4" w:space="0"/>
+          <w:right w:val="none" w:color="000000" w:sz="4" w:space="0"/>
+        </w:tcBorders>
+      </w:tcPr>
+    </w:tblStylePr>
     <w:tblStylePr w:type="nwCell">
       <w:pPr>
         <w:pBdr/>
@@ -6407,9 +6649,9 @@
       </w:tcPr>
     </w:tblStylePr>
   </w:style>
-  <w:style w:type="table" w:styleId="36">
+  <w:style w:type="table" w:styleId="725">
     <w:name w:val="Grid Table 3 - Accent 3"/>
-    <w:basedOn w:val="666"/>
+    <w:basedOn w:val="889"/>
     <w:uiPriority w:val="99"/>
     <w:pPr>
       <w:pBdr/>
@@ -6508,29 +6750,6 @@
         <w:tblBorders/>
       </w:tblPr>
       <w:tcPr>
-        <w:shd w:color="ffffff"/>
-        <w:tcBorders>
-          <w:top w:val="none" w:color="000000" w:sz="4" w:space="0"/>
-          <w:left w:val="none" w:color="000000" w:sz="4" w:space="0"/>
-          <w:bottom w:val="none" w:color="000000" w:sz="4" w:space="0"/>
-          <w:right w:val="none" w:color="000000" w:sz="4" w:space="0"/>
-        </w:tcBorders>
-      </w:tcPr>
-    </w:tblStylePr>
-    <w:tblStylePr w:type="firstRow">
-      <w:rPr>
-        <w:b/>
-        <w:color w:val="404040"/>
-      </w:rPr>
-      <w:pPr>
-        <w:pBdr/>
-        <w:spacing/>
-        <w:ind/>
-      </w:pPr>
-      <w:tblPr>
-        <w:tblBorders/>
-      </w:tblPr>
-      <w:tcPr>
         <w:shd w:val="clear" w:color="ffffff"/>
         <w:tcBorders>
           <w:top w:val="none" w:color="000000" w:sz="4" w:space="0"/>
@@ -6540,30 +6759,7 @@
         </w:tcBorders>
       </w:tcPr>
     </w:tblStylePr>
-    <w:tblStylePr w:type="lastCol">
-      <w:rPr>
-        <w:i/>
-        <w:color w:val="404040"/>
-      </w:rPr>
-      <w:pPr>
-        <w:pBdr/>
-        <w:spacing/>
-        <w:ind/>
-      </w:pPr>
-      <w:tblPr>
-        <w:tblBorders/>
-      </w:tblPr>
-      <w:tcPr>
-        <w:shd w:color="ffffff"/>
-        <w:tcBorders>
-          <w:top w:val="none" w:color="000000" w:sz="4" w:space="0"/>
-          <w:left w:val="none" w:color="000000" w:sz="4" w:space="0"/>
-          <w:bottom w:val="none" w:color="000000" w:sz="4" w:space="0"/>
-          <w:right w:val="none" w:color="000000" w:sz="4" w:space="0"/>
-        </w:tcBorders>
-      </w:tcPr>
-    </w:tblStylePr>
-    <w:tblStylePr w:type="lastRow">
+    <w:tblStylePr w:type="firstRow">
       <w:rPr>
         <w:b/>
         <w:color w:val="404040"/>
@@ -6586,6 +6782,52 @@
         </w:tcBorders>
       </w:tcPr>
     </w:tblStylePr>
+    <w:tblStylePr w:type="lastCol">
+      <w:rPr>
+        <w:i/>
+        <w:color w:val="404040"/>
+      </w:rPr>
+      <w:pPr>
+        <w:pBdr/>
+        <w:spacing/>
+        <w:ind/>
+      </w:pPr>
+      <w:tblPr>
+        <w:tblBorders/>
+      </w:tblPr>
+      <w:tcPr>
+        <w:shd w:val="clear" w:color="ffffff"/>
+        <w:tcBorders>
+          <w:top w:val="none" w:color="000000" w:sz="4" w:space="0"/>
+          <w:left w:val="none" w:color="000000" w:sz="4" w:space="0"/>
+          <w:bottom w:val="none" w:color="000000" w:sz="4" w:space="0"/>
+          <w:right w:val="none" w:color="000000" w:sz="4" w:space="0"/>
+        </w:tcBorders>
+      </w:tcPr>
+    </w:tblStylePr>
+    <w:tblStylePr w:type="lastRow">
+      <w:rPr>
+        <w:b/>
+        <w:color w:val="404040"/>
+      </w:rPr>
+      <w:pPr>
+        <w:pBdr/>
+        <w:spacing/>
+        <w:ind/>
+      </w:pPr>
+      <w:tblPr>
+        <w:tblBorders/>
+      </w:tblPr>
+      <w:tcPr>
+        <w:shd w:val="clear" w:color="ffffff"/>
+        <w:tcBorders>
+          <w:top w:val="none" w:color="000000" w:sz="4" w:space="0"/>
+          <w:left w:val="none" w:color="000000" w:sz="4" w:space="0"/>
+          <w:bottom w:val="none" w:color="000000" w:sz="4" w:space="0"/>
+          <w:right w:val="none" w:color="000000" w:sz="4" w:space="0"/>
+        </w:tcBorders>
+      </w:tcPr>
+    </w:tblStylePr>
     <w:tblStylePr w:type="nwCell">
       <w:pPr>
         <w:pBdr/>
@@ -6652,9 +6894,9 @@
       </w:tcPr>
     </w:tblStylePr>
   </w:style>
-  <w:style w:type="table" w:styleId="37">
+  <w:style w:type="table" w:styleId="726">
     <w:name w:val="Grid Table 3 - Accent 4"/>
-    <w:basedOn w:val="666"/>
+    <w:basedOn w:val="889"/>
     <w:uiPriority w:val="99"/>
     <w:pPr>
       <w:pBdr/>
@@ -6753,29 +6995,6 @@
         <w:tblBorders/>
       </w:tblPr>
       <w:tcPr>
-        <w:shd w:color="ffffff"/>
-        <w:tcBorders>
-          <w:top w:val="none" w:color="000000" w:sz="4" w:space="0"/>
-          <w:left w:val="none" w:color="000000" w:sz="4" w:space="0"/>
-          <w:bottom w:val="none" w:color="000000" w:sz="4" w:space="0"/>
-          <w:right w:val="none" w:color="000000" w:sz="4" w:space="0"/>
-        </w:tcBorders>
-      </w:tcPr>
-    </w:tblStylePr>
-    <w:tblStylePr w:type="firstRow">
-      <w:rPr>
-        <w:b/>
-        <w:color w:val="404040"/>
-      </w:rPr>
-      <w:pPr>
-        <w:pBdr/>
-        <w:spacing/>
-        <w:ind/>
-      </w:pPr>
-      <w:tblPr>
-        <w:tblBorders/>
-      </w:tblPr>
-      <w:tcPr>
         <w:shd w:val="clear" w:color="ffffff"/>
         <w:tcBorders>
           <w:top w:val="none" w:color="000000" w:sz="4" w:space="0"/>
@@ -6785,30 +7004,7 @@
         </w:tcBorders>
       </w:tcPr>
     </w:tblStylePr>
-    <w:tblStylePr w:type="lastCol">
-      <w:rPr>
-        <w:i/>
-        <w:color w:val="404040"/>
-      </w:rPr>
-      <w:pPr>
-        <w:pBdr/>
-        <w:spacing/>
-        <w:ind/>
-      </w:pPr>
-      <w:tblPr>
-        <w:tblBorders/>
-      </w:tblPr>
-      <w:tcPr>
-        <w:shd w:color="ffffff"/>
-        <w:tcBorders>
-          <w:top w:val="none" w:color="000000" w:sz="4" w:space="0"/>
-          <w:left w:val="none" w:color="000000" w:sz="4" w:space="0"/>
-          <w:bottom w:val="none" w:color="000000" w:sz="4" w:space="0"/>
-          <w:right w:val="none" w:color="000000" w:sz="4" w:space="0"/>
-        </w:tcBorders>
-      </w:tcPr>
-    </w:tblStylePr>
-    <w:tblStylePr w:type="lastRow">
+    <w:tblStylePr w:type="firstRow">
       <w:rPr>
         <w:b/>
         <w:color w:val="404040"/>
@@ -6831,6 +7027,52 @@
         </w:tcBorders>
       </w:tcPr>
     </w:tblStylePr>
+    <w:tblStylePr w:type="lastCol">
+      <w:rPr>
+        <w:i/>
+        <w:color w:val="404040"/>
+      </w:rPr>
+      <w:pPr>
+        <w:pBdr/>
+        <w:spacing/>
+        <w:ind/>
+      </w:pPr>
+      <w:tblPr>
+        <w:tblBorders/>
+      </w:tblPr>
+      <w:tcPr>
+        <w:shd w:val="clear" w:color="ffffff"/>
+        <w:tcBorders>
+          <w:top w:val="none" w:color="000000" w:sz="4" w:space="0"/>
+          <w:left w:val="none" w:color="000000" w:sz="4" w:space="0"/>
+          <w:bottom w:val="none" w:color="000000" w:sz="4" w:space="0"/>
+          <w:right w:val="none" w:color="000000" w:sz="4" w:space="0"/>
+        </w:tcBorders>
+      </w:tcPr>
+    </w:tblStylePr>
+    <w:tblStylePr w:type="lastRow">
+      <w:rPr>
+        <w:b/>
+        <w:color w:val="404040"/>
+      </w:rPr>
+      <w:pPr>
+        <w:pBdr/>
+        <w:spacing/>
+        <w:ind/>
+      </w:pPr>
+      <w:tblPr>
+        <w:tblBorders/>
+      </w:tblPr>
+      <w:tcPr>
+        <w:shd w:val="clear" w:color="ffffff"/>
+        <w:tcBorders>
+          <w:top w:val="none" w:color="000000" w:sz="4" w:space="0"/>
+          <w:left w:val="none" w:color="000000" w:sz="4" w:space="0"/>
+          <w:bottom w:val="none" w:color="000000" w:sz="4" w:space="0"/>
+          <w:right w:val="none" w:color="000000" w:sz="4" w:space="0"/>
+        </w:tcBorders>
+      </w:tcPr>
+    </w:tblStylePr>
     <w:tblStylePr w:type="nwCell">
       <w:pPr>
         <w:pBdr/>
@@ -6897,9 +7139,9 @@
       </w:tcPr>
     </w:tblStylePr>
   </w:style>
-  <w:style w:type="table" w:styleId="38">
+  <w:style w:type="table" w:styleId="727">
     <w:name w:val="Grid Table 3 - Accent 5"/>
-    <w:basedOn w:val="666"/>
+    <w:basedOn w:val="889"/>
     <w:uiPriority w:val="99"/>
     <w:pPr>
       <w:pBdr/>
@@ -6998,29 +7240,6 @@
         <w:tblBorders/>
       </w:tblPr>
       <w:tcPr>
-        <w:shd w:color="ffffff"/>
-        <w:tcBorders>
-          <w:top w:val="none" w:color="000000" w:sz="4" w:space="0"/>
-          <w:left w:val="none" w:color="000000" w:sz="4" w:space="0"/>
-          <w:bottom w:val="none" w:color="000000" w:sz="4" w:space="0"/>
-          <w:right w:val="none" w:color="000000" w:sz="4" w:space="0"/>
-        </w:tcBorders>
-      </w:tcPr>
-    </w:tblStylePr>
-    <w:tblStylePr w:type="firstRow">
-      <w:rPr>
-        <w:b/>
-        <w:color w:val="404040"/>
-      </w:rPr>
-      <w:pPr>
-        <w:pBdr/>
-        <w:spacing/>
-        <w:ind/>
-      </w:pPr>
-      <w:tblPr>
-        <w:tblBorders/>
-      </w:tblPr>
-      <w:tcPr>
         <w:shd w:val="clear" w:color="ffffff"/>
         <w:tcBorders>
           <w:top w:val="none" w:color="000000" w:sz="4" w:space="0"/>
@@ -7030,30 +7249,7 @@
         </w:tcBorders>
       </w:tcPr>
     </w:tblStylePr>
-    <w:tblStylePr w:type="lastCol">
-      <w:rPr>
-        <w:i/>
-        <w:color w:val="404040"/>
-      </w:rPr>
-      <w:pPr>
-        <w:pBdr/>
-        <w:spacing/>
-        <w:ind/>
-      </w:pPr>
-      <w:tblPr>
-        <w:tblBorders/>
-      </w:tblPr>
-      <w:tcPr>
-        <w:shd w:color="ffffff"/>
-        <w:tcBorders>
-          <w:top w:val="none" w:color="000000" w:sz="4" w:space="0"/>
-          <w:left w:val="none" w:color="000000" w:sz="4" w:space="0"/>
-          <w:bottom w:val="none" w:color="000000" w:sz="4" w:space="0"/>
-          <w:right w:val="none" w:color="000000" w:sz="4" w:space="0"/>
-        </w:tcBorders>
-      </w:tcPr>
-    </w:tblStylePr>
-    <w:tblStylePr w:type="lastRow">
+    <w:tblStylePr w:type="firstRow">
       <w:rPr>
         <w:b/>
         <w:color w:val="404040"/>
@@ -7076,6 +7272,52 @@
         </w:tcBorders>
       </w:tcPr>
     </w:tblStylePr>
+    <w:tblStylePr w:type="lastCol">
+      <w:rPr>
+        <w:i/>
+        <w:color w:val="404040"/>
+      </w:rPr>
+      <w:pPr>
+        <w:pBdr/>
+        <w:spacing/>
+        <w:ind/>
+      </w:pPr>
+      <w:tblPr>
+        <w:tblBorders/>
+      </w:tblPr>
+      <w:tcPr>
+        <w:shd w:val="clear" w:color="ffffff"/>
+        <w:tcBorders>
+          <w:top w:val="none" w:color="000000" w:sz="4" w:space="0"/>
+          <w:left w:val="none" w:color="000000" w:sz="4" w:space="0"/>
+          <w:bottom w:val="none" w:color="000000" w:sz="4" w:space="0"/>
+          <w:right w:val="none" w:color="000000" w:sz="4" w:space="0"/>
+        </w:tcBorders>
+      </w:tcPr>
+    </w:tblStylePr>
+    <w:tblStylePr w:type="lastRow">
+      <w:rPr>
+        <w:b/>
+        <w:color w:val="404040"/>
+      </w:rPr>
+      <w:pPr>
+        <w:pBdr/>
+        <w:spacing/>
+        <w:ind/>
+      </w:pPr>
+      <w:tblPr>
+        <w:tblBorders/>
+      </w:tblPr>
+      <w:tcPr>
+        <w:shd w:val="clear" w:color="ffffff"/>
+        <w:tcBorders>
+          <w:top w:val="none" w:color="000000" w:sz="4" w:space="0"/>
+          <w:left w:val="none" w:color="000000" w:sz="4" w:space="0"/>
+          <w:bottom w:val="none" w:color="000000" w:sz="4" w:space="0"/>
+          <w:right w:val="none" w:color="000000" w:sz="4" w:space="0"/>
+        </w:tcBorders>
+      </w:tcPr>
+    </w:tblStylePr>
     <w:tblStylePr w:type="nwCell">
       <w:pPr>
         <w:pBdr/>
@@ -7142,9 +7384,9 @@
       </w:tcPr>
     </w:tblStylePr>
   </w:style>
-  <w:style w:type="table" w:styleId="39">
+  <w:style w:type="table" w:styleId="728">
     <w:name w:val="Grid Table 3 - Accent 6"/>
-    <w:basedOn w:val="666"/>
+    <w:basedOn w:val="889"/>
     <w:uiPriority w:val="99"/>
     <w:pPr>
       <w:pBdr/>
@@ -7243,29 +7485,6 @@
         <w:tblBorders/>
       </w:tblPr>
       <w:tcPr>
-        <w:shd w:color="ffffff"/>
-        <w:tcBorders>
-          <w:top w:val="none" w:color="000000" w:sz="4" w:space="0"/>
-          <w:left w:val="none" w:color="000000" w:sz="4" w:space="0"/>
-          <w:bottom w:val="none" w:color="000000" w:sz="4" w:space="0"/>
-          <w:right w:val="none" w:color="000000" w:sz="4" w:space="0"/>
-        </w:tcBorders>
-      </w:tcPr>
-    </w:tblStylePr>
-    <w:tblStylePr w:type="firstRow">
-      <w:rPr>
-        <w:b/>
-        <w:color w:val="404040"/>
-      </w:rPr>
-      <w:pPr>
-        <w:pBdr/>
-        <w:spacing/>
-        <w:ind/>
-      </w:pPr>
-      <w:tblPr>
-        <w:tblBorders/>
-      </w:tblPr>
-      <w:tcPr>
         <w:shd w:val="clear" w:color="ffffff"/>
         <w:tcBorders>
           <w:top w:val="none" w:color="000000" w:sz="4" w:space="0"/>
@@ -7275,30 +7494,7 @@
         </w:tcBorders>
       </w:tcPr>
     </w:tblStylePr>
-    <w:tblStylePr w:type="lastCol">
-      <w:rPr>
-        <w:i/>
-        <w:color w:val="404040"/>
-      </w:rPr>
-      <w:pPr>
-        <w:pBdr/>
-        <w:spacing/>
-        <w:ind/>
-      </w:pPr>
-      <w:tblPr>
-        <w:tblBorders/>
-      </w:tblPr>
-      <w:tcPr>
-        <w:shd w:color="ffffff"/>
-        <w:tcBorders>
-          <w:top w:val="none" w:color="000000" w:sz="4" w:space="0"/>
-          <w:left w:val="none" w:color="000000" w:sz="4" w:space="0"/>
-          <w:bottom w:val="none" w:color="000000" w:sz="4" w:space="0"/>
-          <w:right w:val="none" w:color="000000" w:sz="4" w:space="0"/>
-        </w:tcBorders>
-      </w:tcPr>
-    </w:tblStylePr>
-    <w:tblStylePr w:type="lastRow">
+    <w:tblStylePr w:type="firstRow">
       <w:rPr>
         <w:b/>
         <w:color w:val="404040"/>
@@ -7321,6 +7517,52 @@
         </w:tcBorders>
       </w:tcPr>
     </w:tblStylePr>
+    <w:tblStylePr w:type="lastCol">
+      <w:rPr>
+        <w:i/>
+        <w:color w:val="404040"/>
+      </w:rPr>
+      <w:pPr>
+        <w:pBdr/>
+        <w:spacing/>
+        <w:ind/>
+      </w:pPr>
+      <w:tblPr>
+        <w:tblBorders/>
+      </w:tblPr>
+      <w:tcPr>
+        <w:shd w:val="clear" w:color="ffffff"/>
+        <w:tcBorders>
+          <w:top w:val="none" w:color="000000" w:sz="4" w:space="0"/>
+          <w:left w:val="none" w:color="000000" w:sz="4" w:space="0"/>
+          <w:bottom w:val="none" w:color="000000" w:sz="4" w:space="0"/>
+          <w:right w:val="none" w:color="000000" w:sz="4" w:space="0"/>
+        </w:tcBorders>
+      </w:tcPr>
+    </w:tblStylePr>
+    <w:tblStylePr w:type="lastRow">
+      <w:rPr>
+        <w:b/>
+        <w:color w:val="404040"/>
+      </w:rPr>
+      <w:pPr>
+        <w:pBdr/>
+        <w:spacing/>
+        <w:ind/>
+      </w:pPr>
+      <w:tblPr>
+        <w:tblBorders/>
+      </w:tblPr>
+      <w:tcPr>
+        <w:shd w:val="clear" w:color="ffffff"/>
+        <w:tcBorders>
+          <w:top w:val="none" w:color="000000" w:sz="4" w:space="0"/>
+          <w:left w:val="none" w:color="000000" w:sz="4" w:space="0"/>
+          <w:bottom w:val="none" w:color="000000" w:sz="4" w:space="0"/>
+          <w:right w:val="none" w:color="000000" w:sz="4" w:space="0"/>
+        </w:tcBorders>
+      </w:tcPr>
+    </w:tblStylePr>
     <w:tblStylePr w:type="nwCell">
       <w:pPr>
         <w:pBdr/>
@@ -7387,9 +7629,9 @@
       </w:tcPr>
     </w:tblStylePr>
   </w:style>
-  <w:style w:type="table" w:styleId="40">
+  <w:style w:type="table" w:styleId="729">
     <w:name w:val="Grid Table 4"/>
-    <w:basedOn w:val="666"/>
+    <w:basedOn w:val="889"/>
     <w:uiPriority w:val="59"/>
     <w:pPr>
       <w:pBdr/>
@@ -7620,9 +7862,9 @@
       </w:tcPr>
     </w:tblStylePr>
   </w:style>
-  <w:style w:type="table" w:styleId="41">
+  <w:style w:type="table" w:styleId="730">
     <w:name w:val="Grid Table 4 - Accent 1"/>
-    <w:basedOn w:val="666"/>
+    <w:basedOn w:val="889"/>
     <w:uiPriority w:val="59"/>
     <w:pPr>
       <w:pBdr/>
@@ -7853,9 +8095,9 @@
       </w:tcPr>
     </w:tblStylePr>
   </w:style>
-  <w:style w:type="table" w:styleId="42">
+  <w:style w:type="table" w:styleId="731">
     <w:name w:val="Grid Table 4 - Accent 2"/>
-    <w:basedOn w:val="666"/>
+    <w:basedOn w:val="889"/>
     <w:uiPriority w:val="59"/>
     <w:pPr>
       <w:pBdr/>
@@ -8086,9 +8328,9 @@
       </w:tcPr>
     </w:tblStylePr>
   </w:style>
-  <w:style w:type="table" w:styleId="43">
+  <w:style w:type="table" w:styleId="732">
     <w:name w:val="Grid Table 4 - Accent 3"/>
-    <w:basedOn w:val="666"/>
+    <w:basedOn w:val="889"/>
     <w:uiPriority w:val="59"/>
     <w:pPr>
       <w:pBdr/>
@@ -8319,9 +8561,9 @@
       </w:tcPr>
     </w:tblStylePr>
   </w:style>
-  <w:style w:type="table" w:styleId="44">
+  <w:style w:type="table" w:styleId="733">
     <w:name w:val="Grid Table 4 - Accent 4"/>
-    <w:basedOn w:val="666"/>
+    <w:basedOn w:val="889"/>
     <w:uiPriority w:val="59"/>
     <w:pPr>
       <w:pBdr/>
@@ -8552,9 +8794,9 @@
       </w:tcPr>
     </w:tblStylePr>
   </w:style>
-  <w:style w:type="table" w:styleId="45">
+  <w:style w:type="table" w:styleId="734">
     <w:name w:val="Grid Table 4 - Accent 5"/>
-    <w:basedOn w:val="666"/>
+    <w:basedOn w:val="889"/>
     <w:uiPriority w:val="59"/>
     <w:pPr>
       <w:pBdr/>
@@ -8785,9 +9027,9 @@
       </w:tcPr>
     </w:tblStylePr>
   </w:style>
-  <w:style w:type="table" w:styleId="46">
+  <w:style w:type="table" w:styleId="735">
     <w:name w:val="Grid Table 4 - Accent 6"/>
-    <w:basedOn w:val="666"/>
+    <w:basedOn w:val="889"/>
     <w:uiPriority w:val="59"/>
     <w:pPr>
       <w:pBdr/>
@@ -9018,9 +9260,9 @@
       </w:tcPr>
     </w:tblStylePr>
   </w:style>
-  <w:style w:type="table" w:styleId="47">
+  <w:style w:type="table" w:styleId="736">
     <w:name w:val="Grid Table 5 Dark"/>
-    <w:basedOn w:val="666"/>
+    <w:basedOn w:val="889"/>
     <w:uiPriority w:val="99"/>
     <w:pPr>
       <w:pBdr/>
@@ -9246,9 +9488,9 @@
       </w:tcPr>
     </w:tblStylePr>
   </w:style>
-  <w:style w:type="table" w:styleId="48">
+  <w:style w:type="table" w:styleId="737">
     <w:name w:val="Grid Table 5 Dark- Accent 1"/>
-    <w:basedOn w:val="666"/>
+    <w:basedOn w:val="889"/>
     <w:uiPriority w:val="99"/>
     <w:pPr>
       <w:pBdr/>
@@ -9474,9 +9716,9 @@
       </w:tcPr>
     </w:tblStylePr>
   </w:style>
-  <w:style w:type="table" w:styleId="49">
+  <w:style w:type="table" w:styleId="738">
     <w:name w:val="Grid Table 5 Dark - Accent 2"/>
-    <w:basedOn w:val="666"/>
+    <w:basedOn w:val="889"/>
     <w:uiPriority w:val="99"/>
     <w:pPr>
       <w:pBdr/>
@@ -9702,9 +9944,9 @@
       </w:tcPr>
     </w:tblStylePr>
   </w:style>
-  <w:style w:type="table" w:styleId="50">
+  <w:style w:type="table" w:styleId="739">
     <w:name w:val="Grid Table 5 Dark - Accent 3"/>
-    <w:basedOn w:val="666"/>
+    <w:basedOn w:val="889"/>
     <w:uiPriority w:val="99"/>
     <w:pPr>
       <w:pBdr/>
@@ -9930,9 +10172,9 @@
       </w:tcPr>
     </w:tblStylePr>
   </w:style>
-  <w:style w:type="table" w:styleId="51">
+  <w:style w:type="table" w:styleId="740">
     <w:name w:val="Grid Table 5 Dark- Accent 4"/>
-    <w:basedOn w:val="666"/>
+    <w:basedOn w:val="889"/>
     <w:uiPriority w:val="99"/>
     <w:pPr>
       <w:pBdr/>
@@ -10158,9 +10400,9 @@
       </w:tcPr>
     </w:tblStylePr>
   </w:style>
-  <w:style w:type="table" w:styleId="52">
+  <w:style w:type="table" w:styleId="741">
     <w:name w:val="Grid Table 5 Dark - Accent 5"/>
-    <w:basedOn w:val="666"/>
+    <w:basedOn w:val="889"/>
     <w:uiPriority w:val="99"/>
     <w:pPr>
       <w:pBdr/>
@@ -10386,9 +10628,9 @@
       </w:tcPr>
     </w:tblStylePr>
   </w:style>
-  <w:style w:type="table" w:styleId="53">
+  <w:style w:type="table" w:styleId="742">
     <w:name w:val="Grid Table 5 Dark - Accent 6"/>
-    <w:basedOn w:val="666"/>
+    <w:basedOn w:val="889"/>
     <w:uiPriority w:val="99"/>
     <w:pPr>
       <w:pBdr/>
@@ -10614,9 +10856,9 @@
       </w:tcPr>
     </w:tblStylePr>
   </w:style>
-  <w:style w:type="table" w:styleId="54">
+  <w:style w:type="table" w:styleId="743">
     <w:name w:val="Grid Table 6 Colorful"/>
-    <w:basedOn w:val="666"/>
+    <w:basedOn w:val="889"/>
     <w:uiPriority w:val="99"/>
     <w:pPr>
       <w:pBdr/>
@@ -10844,9 +11086,9 @@
       </w:tcPr>
     </w:tblStylePr>
   </w:style>
-  <w:style w:type="table" w:styleId="55">
+  <w:style w:type="table" w:styleId="744">
     <w:name w:val="Grid Table 6 Colorful - Accent 1"/>
-    <w:basedOn w:val="666"/>
+    <w:basedOn w:val="889"/>
     <w:uiPriority w:val="99"/>
     <w:pPr>
       <w:pBdr/>
@@ -11074,9 +11316,9 @@
       </w:tcPr>
     </w:tblStylePr>
   </w:style>
-  <w:style w:type="table" w:styleId="56">
+  <w:style w:type="table" w:styleId="745">
     <w:name w:val="Grid Table 6 Colorful - Accent 2"/>
-    <w:basedOn w:val="666"/>
+    <w:basedOn w:val="889"/>
     <w:uiPriority w:val="99"/>
     <w:pPr>
       <w:pBdr/>
@@ -11304,9 +11546,9 @@
       </w:tcPr>
     </w:tblStylePr>
   </w:style>
-  <w:style w:type="table" w:styleId="57">
+  <w:style w:type="table" w:styleId="746">
     <w:name w:val="Grid Table 6 Colorful - Accent 3"/>
-    <w:basedOn w:val="666"/>
+    <w:basedOn w:val="889"/>
     <w:uiPriority w:val="99"/>
     <w:pPr>
       <w:pBdr/>
@@ -11534,9 +11776,9 @@
       </w:tcPr>
     </w:tblStylePr>
   </w:style>
-  <w:style w:type="table" w:styleId="58">
+  <w:style w:type="table" w:styleId="747">
     <w:name w:val="Grid Table 6 Colorful - Accent 4"/>
-    <w:basedOn w:val="666"/>
+    <w:basedOn w:val="889"/>
     <w:uiPriority w:val="99"/>
     <w:pPr>
       <w:pBdr/>
@@ -11764,9 +12006,9 @@
       </w:tcPr>
     </w:tblStylePr>
   </w:style>
-  <w:style w:type="table" w:styleId="59">
+  <w:style w:type="table" w:styleId="748">
     <w:name w:val="Grid Table 6 Colorful - Accent 5"/>
-    <w:basedOn w:val="666"/>
+    <w:basedOn w:val="889"/>
     <w:uiPriority w:val="99"/>
     <w:pPr>
       <w:pBdr/>
@@ -11994,9 +12236,9 @@
       </w:tcPr>
     </w:tblStylePr>
   </w:style>
-  <w:style w:type="table" w:styleId="60">
+  <w:style w:type="table" w:styleId="749">
     <w:name w:val="Grid Table 6 Colorful - Accent 6"/>
-    <w:basedOn w:val="666"/>
+    <w:basedOn w:val="889"/>
     <w:uiPriority w:val="99"/>
     <w:pPr>
       <w:pBdr/>
@@ -12224,9 +12466,9 @@
       </w:tcPr>
     </w:tblStylePr>
   </w:style>
-  <w:style w:type="table" w:styleId="61">
+  <w:style w:type="table" w:styleId="750">
     <w:name w:val="Grid Table 7 Colorful"/>
-    <w:basedOn w:val="666"/>
+    <w:basedOn w:val="889"/>
     <w:uiPriority w:val="99"/>
     <w:pPr>
       <w:pBdr/>
@@ -12328,11 +12570,11 @@
         <w:tblBorders/>
       </w:tblPr>
       <w:tcPr>
-        <w:shd w:color="ffffff"/>
+        <w:shd w:val="clear" w:color="ffffff"/>
         <w:tcBorders>
-          <w:top w:val="none"/>
-          <w:left w:val="none"/>
-          <w:bottom w:val="none"/>
+          <w:top w:val="none" w:color="000000" w:sz="4" w:space="0"/>
+          <w:left w:val="none" w:color="000000" w:sz="4" w:space="0"/>
+          <w:bottom w:val="none" w:color="000000" w:sz="4" w:space="0"/>
           <w:right w:val="single" w:color="000000" w:themeColor="text1" w:themeTint="80" w:sz="4" w:space="0"/>
         </w:tcBorders>
       </w:tcPr>
@@ -12355,10 +12597,10 @@
       <w:tcPr>
         <w:shd w:val="clear" w:color="ffffff" w:themeColor="light1" w:fill="ffffff" w:themeFill="light1"/>
         <w:tcBorders>
-          <w:top w:val="none"/>
-          <w:left w:val="none"/>
+          <w:top w:val="none" w:color="000000" w:sz="4" w:space="0"/>
+          <w:left w:val="none" w:color="000000" w:sz="4" w:space="0"/>
           <w:bottom w:val="single" w:color="000000" w:themeColor="text1" w:themeTint="80" w:sz="4" w:space="0"/>
-          <w:right w:val="none"/>
+          <w:right w:val="none" w:color="000000" w:sz="4" w:space="0"/>
         </w:tcBorders>
       </w:tcPr>
     </w:tblStylePr>
@@ -12378,12 +12620,12 @@
         <w:tblBorders/>
       </w:tblPr>
       <w:tcPr>
-        <w:shd w:color="ffffff"/>
+        <w:shd w:val="clear" w:color="ffffff"/>
         <w:tcBorders>
-          <w:top w:val="none"/>
+          <w:top w:val="none" w:color="000000" w:sz="4" w:space="0"/>
           <w:left w:val="single" w:color="000000" w:themeColor="text1" w:themeTint="80" w:sz="4" w:space="0"/>
-          <w:bottom w:val="none"/>
-          <w:right w:val="none"/>
+          <w:bottom w:val="none" w:color="000000" w:sz="4" w:space="0"/>
+          <w:right w:val="none" w:color="000000" w:sz="4" w:space="0"/>
         </w:tcBorders>
       </w:tcPr>
     </w:tblStylePr>
@@ -12406,9 +12648,9 @@
         <w:shd w:val="clear" w:color="ffffff" w:themeColor="light1" w:fill="ffffff" w:themeFill="light1"/>
         <w:tcBorders>
           <w:top w:val="single" w:color="000000" w:themeColor="text1" w:themeTint="80" w:sz="4" w:space="0"/>
-          <w:left w:val="none"/>
-          <w:bottom w:val="none"/>
-          <w:right w:val="none"/>
+          <w:left w:val="none" w:color="000000" w:sz="4" w:space="0"/>
+          <w:bottom w:val="none" w:color="000000" w:sz="4" w:space="0"/>
+          <w:right w:val="none" w:color="000000" w:sz="4" w:space="0"/>
         </w:tcBorders>
       </w:tcPr>
     </w:tblStylePr>
@@ -12478,9 +12720,9 @@
       </w:tcPr>
     </w:tblStylePr>
   </w:style>
-  <w:style w:type="table" w:styleId="62">
+  <w:style w:type="table" w:styleId="751">
     <w:name w:val="Grid Table 7 Colorful - Accent 1"/>
-    <w:basedOn w:val="666"/>
+    <w:basedOn w:val="889"/>
     <w:uiPriority w:val="99"/>
     <w:pPr>
       <w:pBdr/>
@@ -12582,11 +12824,11 @@
         <w:tblBorders/>
       </w:tblPr>
       <w:tcPr>
-        <w:shd w:color="ffffff"/>
+        <w:shd w:val="clear" w:color="ffffff"/>
         <w:tcBorders>
-          <w:top w:val="none"/>
-          <w:left w:val="none"/>
-          <w:bottom w:val="none"/>
+          <w:top w:val="none" w:color="000000" w:sz="4" w:space="0"/>
+          <w:left w:val="none" w:color="000000" w:sz="4" w:space="0"/>
+          <w:bottom w:val="none" w:color="000000" w:sz="4" w:space="0"/>
           <w:right w:val="single" w:color="000000" w:themeColor="accent1" w:themeTint="80" w:sz="4" w:space="0"/>
         </w:tcBorders>
       </w:tcPr>
@@ -12609,10 +12851,10 @@
       <w:tcPr>
         <w:shd w:val="clear" w:color="ffffff" w:themeColor="light1" w:fill="ffffff" w:themeFill="light1"/>
         <w:tcBorders>
-          <w:top w:val="none"/>
-          <w:left w:val="none"/>
+          <w:top w:val="none" w:color="000000" w:sz="4" w:space="0"/>
+          <w:left w:val="none" w:color="000000" w:sz="4" w:space="0"/>
           <w:bottom w:val="single" w:color="000000" w:themeColor="accent1" w:themeTint="80" w:sz="4" w:space="0"/>
-          <w:right w:val="none"/>
+          <w:right w:val="none" w:color="000000" w:sz="4" w:space="0"/>
         </w:tcBorders>
       </w:tcPr>
     </w:tblStylePr>
@@ -12632,12 +12874,12 @@
         <w:tblBorders/>
       </w:tblPr>
       <w:tcPr>
-        <w:shd w:color="ffffff"/>
+        <w:shd w:val="clear" w:color="ffffff"/>
         <w:tcBorders>
-          <w:top w:val="none"/>
+          <w:top w:val="none" w:color="000000" w:sz="4" w:space="0"/>
           <w:left w:val="single" w:color="000000" w:themeColor="accent1" w:themeTint="80" w:sz="4" w:space="0"/>
-          <w:bottom w:val="none"/>
-          <w:right w:val="none"/>
+          <w:bottom w:val="none" w:color="000000" w:sz="4" w:space="0"/>
+          <w:right w:val="none" w:color="000000" w:sz="4" w:space="0"/>
         </w:tcBorders>
       </w:tcPr>
     </w:tblStylePr>
@@ -12660,9 +12902,9 @@
         <w:shd w:val="clear" w:color="ffffff" w:themeColor="light1" w:fill="ffffff" w:themeFill="light1"/>
         <w:tcBorders>
           <w:top w:val="single" w:color="000000" w:themeColor="accent1" w:themeTint="80" w:sz="4" w:space="0"/>
-          <w:left w:val="none"/>
-          <w:bottom w:val="none"/>
-          <w:right w:val="none"/>
+          <w:left w:val="none" w:color="000000" w:sz="4" w:space="0"/>
+          <w:bottom w:val="none" w:color="000000" w:sz="4" w:space="0"/>
+          <w:right w:val="none" w:color="000000" w:sz="4" w:space="0"/>
         </w:tcBorders>
       </w:tcPr>
     </w:tblStylePr>
@@ -12732,9 +12974,9 @@
       </w:tcPr>
     </w:tblStylePr>
   </w:style>
-  <w:style w:type="table" w:styleId="63">
+  <w:style w:type="table" w:styleId="752">
     <w:name w:val="Grid Table 7 Colorful - Accent 2"/>
-    <w:basedOn w:val="666"/>
+    <w:basedOn w:val="889"/>
     <w:uiPriority w:val="99"/>
     <w:pPr>
       <w:pBdr/>
@@ -12836,11 +13078,11 @@
         <w:tblBorders/>
       </w:tblPr>
       <w:tcPr>
-        <w:shd w:color="ffffff"/>
+        <w:shd w:val="clear" w:color="ffffff"/>
         <w:tcBorders>
-          <w:top w:val="none"/>
-          <w:left w:val="none"/>
-          <w:bottom w:val="none"/>
+          <w:top w:val="none" w:color="000000" w:sz="4" w:space="0"/>
+          <w:left w:val="none" w:color="000000" w:sz="4" w:space="0"/>
+          <w:bottom w:val="none" w:color="000000" w:sz="4" w:space="0"/>
           <w:right w:val="single" w:color="000000" w:themeColor="accent2" w:themeTint="97" w:sz="4" w:space="0"/>
         </w:tcBorders>
       </w:tcPr>
@@ -12863,10 +13105,10 @@
       <w:tcPr>
         <w:shd w:val="clear" w:color="ffffff" w:themeColor="light1" w:fill="ffffff" w:themeFill="light1"/>
         <w:tcBorders>
-          <w:top w:val="none"/>
-          <w:left w:val="none"/>
+          <w:top w:val="none" w:color="000000" w:sz="4" w:space="0"/>
+          <w:left w:val="none" w:color="000000" w:sz="4" w:space="0"/>
           <w:bottom w:val="single" w:color="000000" w:themeColor="accent2" w:themeTint="97" w:sz="4" w:space="0"/>
-          <w:right w:val="none"/>
+          <w:right w:val="none" w:color="000000" w:sz="4" w:space="0"/>
         </w:tcBorders>
       </w:tcPr>
     </w:tblStylePr>
@@ -12886,12 +13128,12 @@
         <w:tblBorders/>
       </w:tblPr>
       <w:tcPr>
-        <w:shd w:color="ffffff"/>
+        <w:shd w:val="clear" w:color="ffffff"/>
         <w:tcBorders>
-          <w:top w:val="none"/>
+          <w:top w:val="none" w:color="000000" w:sz="4" w:space="0"/>
           <w:left w:val="single" w:color="000000" w:themeColor="accent2" w:themeTint="97" w:sz="4" w:space="0"/>
-          <w:bottom w:val="none"/>
-          <w:right w:val="none"/>
+          <w:bottom w:val="none" w:color="000000" w:sz="4" w:space="0"/>
+          <w:right w:val="none" w:color="000000" w:sz="4" w:space="0"/>
         </w:tcBorders>
       </w:tcPr>
     </w:tblStylePr>
@@ -12914,9 +13156,9 @@
         <w:shd w:val="clear" w:color="ffffff" w:themeColor="light1" w:fill="ffffff" w:themeFill="light1"/>
         <w:tcBorders>
           <w:top w:val="single" w:color="000000" w:themeColor="accent2" w:themeTint="97" w:sz="4" w:space="0"/>
-          <w:left w:val="none"/>
-          <w:bottom w:val="none"/>
-          <w:right w:val="none"/>
+          <w:left w:val="none" w:color="000000" w:sz="4" w:space="0"/>
+          <w:bottom w:val="none" w:color="000000" w:sz="4" w:space="0"/>
+          <w:right w:val="none" w:color="000000" w:sz="4" w:space="0"/>
         </w:tcBorders>
       </w:tcPr>
     </w:tblStylePr>
@@ -12986,9 +13228,9 @@
       </w:tcPr>
     </w:tblStylePr>
   </w:style>
-  <w:style w:type="table" w:styleId="64">
+  <w:style w:type="table" w:styleId="753">
     <w:name w:val="Grid Table 7 Colorful - Accent 3"/>
-    <w:basedOn w:val="666"/>
+    <w:basedOn w:val="889"/>
     <w:uiPriority w:val="99"/>
     <w:pPr>
       <w:pBdr/>
@@ -13090,11 +13332,11 @@
         <w:tblBorders/>
       </w:tblPr>
       <w:tcPr>
-        <w:shd w:color="ffffff"/>
+        <w:shd w:val="clear" w:color="ffffff"/>
         <w:tcBorders>
-          <w:top w:val="none"/>
-          <w:left w:val="none"/>
-          <w:bottom w:val="none"/>
+          <w:top w:val="none" w:color="000000" w:sz="4" w:space="0"/>
+          <w:left w:val="none" w:color="000000" w:sz="4" w:space="0"/>
+          <w:bottom w:val="none" w:color="000000" w:sz="4" w:space="0"/>
           <w:right w:val="single" w:color="000000" w:themeColor="accent3" w:themeTint="FE" w:sz="4" w:space="0"/>
         </w:tcBorders>
       </w:tcPr>
@@ -13117,10 +13359,10 @@
       <w:tcPr>
         <w:shd w:val="clear" w:color="ffffff" w:themeColor="light1" w:fill="ffffff" w:themeFill="light1"/>
         <w:tcBorders>
-          <w:top w:val="none"/>
-          <w:left w:val="none"/>
+          <w:top w:val="none" w:color="000000" w:sz="4" w:space="0"/>
+          <w:left w:val="none" w:color="000000" w:sz="4" w:space="0"/>
           <w:bottom w:val="single" w:color="000000" w:themeColor="accent3" w:themeTint="FE" w:sz="4" w:space="0"/>
-          <w:right w:val="none"/>
+          <w:right w:val="none" w:color="000000" w:sz="4" w:space="0"/>
         </w:tcBorders>
       </w:tcPr>
     </w:tblStylePr>
@@ -13140,12 +13382,12 @@
         <w:tblBorders/>
       </w:tblPr>
       <w:tcPr>
-        <w:shd w:color="ffffff"/>
+        <w:shd w:val="clear" w:color="ffffff"/>
         <w:tcBorders>
-          <w:top w:val="none"/>
+          <w:top w:val="none" w:color="000000" w:sz="4" w:space="0"/>
           <w:left w:val="single" w:color="000000" w:themeColor="accent3" w:themeTint="FE" w:sz="4" w:space="0"/>
-          <w:bottom w:val="none"/>
-          <w:right w:val="none"/>
+          <w:bottom w:val="none" w:color="000000" w:sz="4" w:space="0"/>
+          <w:right w:val="none" w:color="000000" w:sz="4" w:space="0"/>
         </w:tcBorders>
       </w:tcPr>
     </w:tblStylePr>
@@ -13168,9 +13410,9 @@
         <w:shd w:val="clear" w:color="ffffff" w:themeColor="light1" w:fill="ffffff" w:themeFill="light1"/>
         <w:tcBorders>
           <w:top w:val="single" w:color="000000" w:themeColor="accent3" w:themeTint="FE" w:sz="4" w:space="0"/>
-          <w:left w:val="none"/>
-          <w:bottom w:val="none"/>
-          <w:right w:val="none"/>
+          <w:left w:val="none" w:color="000000" w:sz="4" w:space="0"/>
+          <w:bottom w:val="none" w:color="000000" w:sz="4" w:space="0"/>
+          <w:right w:val="none" w:color="000000" w:sz="4" w:space="0"/>
         </w:tcBorders>
       </w:tcPr>
     </w:tblStylePr>
@@ -13240,9 +13482,9 @@
       </w:tcPr>
     </w:tblStylePr>
   </w:style>
-  <w:style w:type="table" w:styleId="65">
+  <w:style w:type="table" w:styleId="754">
     <w:name w:val="Grid Table 7 Colorful - Accent 4"/>
-    <w:basedOn w:val="666"/>
+    <w:basedOn w:val="889"/>
     <w:uiPriority w:val="99"/>
     <w:pPr>
       <w:pBdr/>
@@ -13344,11 +13586,11 @@
         <w:tblBorders/>
       </w:tblPr>
       <w:tcPr>
-        <w:shd w:color="ffffff"/>
+        <w:shd w:val="clear" w:color="ffffff"/>
         <w:tcBorders>
-          <w:top w:val="none"/>
-          <w:left w:val="none"/>
-          <w:bottom w:val="none"/>
+          <w:top w:val="none" w:color="000000" w:sz="4" w:space="0"/>
+          <w:left w:val="none" w:color="000000" w:sz="4" w:space="0"/>
+          <w:bottom w:val="none" w:color="000000" w:sz="4" w:space="0"/>
           <w:right w:val="single" w:color="000000" w:themeColor="accent4" w:themeTint="9A" w:sz="4" w:space="0"/>
         </w:tcBorders>
       </w:tcPr>
@@ -13371,10 +13613,10 @@
       <w:tcPr>
         <w:shd w:val="clear" w:color="ffffff" w:themeColor="light1" w:fill="ffffff" w:themeFill="light1"/>
         <w:tcBorders>
-          <w:top w:val="none"/>
-          <w:left w:val="none"/>
+          <w:top w:val="none" w:color="000000" w:sz="4" w:space="0"/>
+          <w:left w:val="none" w:color="000000" w:sz="4" w:space="0"/>
           <w:bottom w:val="single" w:color="000000" w:themeColor="accent4" w:themeTint="9A" w:sz="4" w:space="0"/>
-          <w:right w:val="none"/>
+          <w:right w:val="none" w:color="000000" w:sz="4" w:space="0"/>
         </w:tcBorders>
       </w:tcPr>
     </w:tblStylePr>
@@ -13394,12 +13636,12 @@
         <w:tblBorders/>
       </w:tblPr>
       <w:tcPr>
-        <w:shd w:color="ffffff"/>
+        <w:shd w:val="clear" w:color="ffffff"/>
         <w:tcBorders>
-          <w:top w:val="none"/>
+          <w:top w:val="none" w:color="000000" w:sz="4" w:space="0"/>
           <w:left w:val="single" w:color="000000" w:themeColor="accent4" w:themeTint="9A" w:sz="4" w:space="0"/>
-          <w:bottom w:val="none"/>
-          <w:right w:val="none"/>
+          <w:bottom w:val="none" w:color="000000" w:sz="4" w:space="0"/>
+          <w:right w:val="none" w:color="000000" w:sz="4" w:space="0"/>
         </w:tcBorders>
       </w:tcPr>
     </w:tblStylePr>
@@ -13422,9 +13664,9 @@
         <w:shd w:val="clear" w:color="ffffff" w:themeColor="light1" w:fill="ffffff" w:themeFill="light1"/>
         <w:tcBorders>
           <w:top w:val="single" w:color="000000" w:themeColor="accent4" w:themeTint="9A" w:sz="4" w:space="0"/>
-          <w:left w:val="none"/>
-          <w:bottom w:val="none"/>
-          <w:right w:val="none"/>
+          <w:left w:val="none" w:color="000000" w:sz="4" w:space="0"/>
+          <w:bottom w:val="none" w:color="000000" w:sz="4" w:space="0"/>
+          <w:right w:val="none" w:color="000000" w:sz="4" w:space="0"/>
         </w:tcBorders>
       </w:tcPr>
     </w:tblStylePr>
@@ -13494,9 +13736,9 @@
       </w:tcPr>
     </w:tblStylePr>
   </w:style>
-  <w:style w:type="table" w:styleId="66">
+  <w:style w:type="table" w:styleId="755">
     <w:name w:val="Grid Table 7 Colorful - Accent 5"/>
-    <w:basedOn w:val="666"/>
+    <w:basedOn w:val="889"/>
     <w:uiPriority w:val="99"/>
     <w:pPr>
       <w:pBdr/>
@@ -13598,11 +13840,11 @@
         <w:tblBorders/>
       </w:tblPr>
       <w:tcPr>
-        <w:shd w:color="ffffff"/>
+        <w:shd w:val="clear" w:color="ffffff"/>
         <w:tcBorders>
-          <w:top w:val="none"/>
-          <w:left w:val="none"/>
-          <w:bottom w:val="none"/>
+          <w:top w:val="none" w:color="000000" w:sz="4" w:space="0"/>
+          <w:left w:val="none" w:color="000000" w:sz="4" w:space="0"/>
+          <w:bottom w:val="none" w:color="000000" w:sz="4" w:space="0"/>
           <w:right w:val="single" w:color="000000" w:themeColor="accent5" w:themeTint="90" w:sz="4" w:space="0"/>
         </w:tcBorders>
       </w:tcPr>
@@ -13625,10 +13867,10 @@
       <w:tcPr>
         <w:shd w:val="clear" w:color="ffffff" w:themeColor="light1" w:fill="ffffff" w:themeFill="light1"/>
         <w:tcBorders>
-          <w:top w:val="none"/>
-          <w:left w:val="none"/>
+          <w:top w:val="none" w:color="000000" w:sz="4" w:space="0"/>
+          <w:left w:val="none" w:color="000000" w:sz="4" w:space="0"/>
           <w:bottom w:val="single" w:color="000000" w:themeColor="accent5" w:themeTint="90" w:sz="4" w:space="0"/>
-          <w:right w:val="none"/>
+          <w:right w:val="none" w:color="000000" w:sz="4" w:space="0"/>
         </w:tcBorders>
       </w:tcPr>
     </w:tblStylePr>
@@ -13648,12 +13890,12 @@
         <w:tblBorders/>
       </w:tblPr>
       <w:tcPr>
-        <w:shd w:color="ffffff"/>
+        <w:shd w:val="clear" w:color="ffffff"/>
         <w:tcBorders>
-          <w:top w:val="none"/>
+          <w:top w:val="none" w:color="000000" w:sz="4" w:space="0"/>
           <w:left w:val="single" w:color="000000" w:themeColor="accent5" w:themeTint="90" w:sz="4" w:space="0"/>
-          <w:bottom w:val="none"/>
-          <w:right w:val="none"/>
+          <w:bottom w:val="none" w:color="000000" w:sz="4" w:space="0"/>
+          <w:right w:val="none" w:color="000000" w:sz="4" w:space="0"/>
         </w:tcBorders>
       </w:tcPr>
     </w:tblStylePr>
@@ -13676,9 +13918,9 @@
         <w:shd w:val="clear" w:color="ffffff" w:themeColor="light1" w:fill="ffffff" w:themeFill="light1"/>
         <w:tcBorders>
           <w:top w:val="single" w:color="000000" w:themeColor="accent5" w:themeTint="90" w:sz="4" w:space="0"/>
-          <w:left w:val="none"/>
-          <w:bottom w:val="none"/>
-          <w:right w:val="none"/>
+          <w:left w:val="none" w:color="000000" w:sz="4" w:space="0"/>
+          <w:bottom w:val="none" w:color="000000" w:sz="4" w:space="0"/>
+          <w:right w:val="none" w:color="000000" w:sz="4" w:space="0"/>
         </w:tcBorders>
       </w:tcPr>
     </w:tblStylePr>
@@ -13748,9 +13990,9 @@
       </w:tcPr>
     </w:tblStylePr>
   </w:style>
-  <w:style w:type="table" w:styleId="67">
+  <w:style w:type="table" w:styleId="756">
     <w:name w:val="Grid Table 7 Colorful - Accent 6"/>
-    <w:basedOn w:val="666"/>
+    <w:basedOn w:val="889"/>
     <w:uiPriority w:val="99"/>
     <w:pPr>
       <w:pBdr/>
@@ -13852,11 +14094,11 @@
         <w:tblBorders/>
       </w:tblPr>
       <w:tcPr>
-        <w:shd w:color="ffffff"/>
+        <w:shd w:val="clear" w:color="ffffff"/>
         <w:tcBorders>
-          <w:top w:val="none"/>
-          <w:left w:val="none"/>
-          <w:bottom w:val="none"/>
+          <w:top w:val="none" w:color="000000" w:sz="4" w:space="0"/>
+          <w:left w:val="none" w:color="000000" w:sz="4" w:space="0"/>
+          <w:bottom w:val="none" w:color="000000" w:sz="4" w:space="0"/>
           <w:right w:val="single" w:color="000000" w:themeColor="accent6" w:themeTint="90" w:sz="4" w:space="0"/>
         </w:tcBorders>
       </w:tcPr>
@@ -13879,10 +14121,10 @@
       <w:tcPr>
         <w:shd w:val="clear" w:color="ffffff" w:themeColor="light1" w:fill="ffffff" w:themeFill="light1"/>
         <w:tcBorders>
-          <w:top w:val="none"/>
-          <w:left w:val="none"/>
+          <w:top w:val="none" w:color="000000" w:sz="4" w:space="0"/>
+          <w:left w:val="none" w:color="000000" w:sz="4" w:space="0"/>
           <w:bottom w:val="single" w:color="000000" w:themeColor="accent6" w:themeTint="90" w:sz="4" w:space="0"/>
-          <w:right w:val="none"/>
+          <w:right w:val="none" w:color="000000" w:sz="4" w:space="0"/>
         </w:tcBorders>
       </w:tcPr>
     </w:tblStylePr>
@@ -13902,12 +14144,12 @@
         <w:tblBorders/>
       </w:tblPr>
       <w:tcPr>
-        <w:shd w:color="ffffff"/>
+        <w:shd w:val="clear" w:color="ffffff"/>
         <w:tcBorders>
-          <w:top w:val="none"/>
+          <w:top w:val="none" w:color="000000" w:sz="4" w:space="0"/>
           <w:left w:val="single" w:color="000000" w:themeColor="accent6" w:themeTint="90" w:sz="4" w:space="0"/>
-          <w:bottom w:val="none"/>
-          <w:right w:val="none"/>
+          <w:bottom w:val="none" w:color="000000" w:sz="4" w:space="0"/>
+          <w:right w:val="none" w:color="000000" w:sz="4" w:space="0"/>
         </w:tcBorders>
       </w:tcPr>
     </w:tblStylePr>
@@ -13930,9 +14172,9 @@
         <w:shd w:val="clear" w:color="ffffff" w:themeColor="light1" w:fill="ffffff" w:themeFill="light1"/>
         <w:tcBorders>
           <w:top w:val="single" w:color="000000" w:themeColor="accent6" w:themeTint="90" w:sz="4" w:space="0"/>
-          <w:left w:val="none"/>
-          <w:bottom w:val="none"/>
-          <w:right w:val="none"/>
+          <w:left w:val="none" w:color="000000" w:sz="4" w:space="0"/>
+          <w:bottom w:val="none" w:color="000000" w:sz="4" w:space="0"/>
+          <w:right w:val="none" w:color="000000" w:sz="4" w:space="0"/>
         </w:tcBorders>
       </w:tcPr>
     </w:tblStylePr>
@@ -14002,9 +14244,9 @@
       </w:tcPr>
     </w:tblStylePr>
   </w:style>
-  <w:style w:type="table" w:styleId="68">
+  <w:style w:type="table" w:styleId="757">
     <w:name w:val="List Table 1 Light"/>
-    <w:basedOn w:val="666"/>
+    <w:basedOn w:val="889"/>
     <w:uiPriority w:val="99"/>
     <w:pPr>
       <w:pBdr/>
@@ -14218,9 +14460,9 @@
       </w:tcPr>
     </w:tblStylePr>
   </w:style>
-  <w:style w:type="table" w:styleId="69">
+  <w:style w:type="table" w:styleId="758">
     <w:name w:val="List Table 1 Light - Accent 1"/>
-    <w:basedOn w:val="666"/>
+    <w:basedOn w:val="889"/>
     <w:uiPriority w:val="99"/>
     <w:pPr>
       <w:pBdr/>
@@ -14434,9 +14676,9 @@
       </w:tcPr>
     </w:tblStylePr>
   </w:style>
-  <w:style w:type="table" w:styleId="70">
+  <w:style w:type="table" w:styleId="759">
     <w:name w:val="List Table 1 Light - Accent 2"/>
-    <w:basedOn w:val="666"/>
+    <w:basedOn w:val="889"/>
     <w:uiPriority w:val="99"/>
     <w:pPr>
       <w:pBdr/>
@@ -14650,9 +14892,9 @@
       </w:tcPr>
     </w:tblStylePr>
   </w:style>
-  <w:style w:type="table" w:styleId="71">
+  <w:style w:type="table" w:styleId="760">
     <w:name w:val="List Table 1 Light - Accent 3"/>
-    <w:basedOn w:val="666"/>
+    <w:basedOn w:val="889"/>
     <w:uiPriority w:val="99"/>
     <w:pPr>
       <w:pBdr/>
@@ -14866,9 +15108,9 @@
       </w:tcPr>
     </w:tblStylePr>
   </w:style>
-  <w:style w:type="table" w:styleId="72">
+  <w:style w:type="table" w:styleId="761">
     <w:name w:val="List Table 1 Light - Accent 4"/>
-    <w:basedOn w:val="666"/>
+    <w:basedOn w:val="889"/>
     <w:uiPriority w:val="99"/>
     <w:pPr>
       <w:pBdr/>
@@ -15082,9 +15324,9 @@
       </w:tcPr>
     </w:tblStylePr>
   </w:style>
-  <w:style w:type="table" w:styleId="73">
+  <w:style w:type="table" w:styleId="762">
     <w:name w:val="List Table 1 Light - Accent 5"/>
-    <w:basedOn w:val="666"/>
+    <w:basedOn w:val="889"/>
     <w:uiPriority w:val="99"/>
     <w:pPr>
       <w:pBdr/>
@@ -15298,9 +15540,9 @@
       </w:tcPr>
     </w:tblStylePr>
   </w:style>
-  <w:style w:type="table" w:styleId="74">
+  <w:style w:type="table" w:styleId="763">
     <w:name w:val="List Table 1 Light - Accent 6"/>
-    <w:basedOn w:val="666"/>
+    <w:basedOn w:val="889"/>
     <w:uiPriority w:val="99"/>
     <w:pPr>
       <w:pBdr/>
@@ -15514,9 +15756,9 @@
       </w:tcPr>
     </w:tblStylePr>
   </w:style>
-  <w:style w:type="table" w:styleId="75">
+  <w:style w:type="table" w:styleId="764">
     <w:name w:val="List Table 2"/>
-    <w:basedOn w:val="666"/>
+    <w:basedOn w:val="889"/>
     <w:uiPriority w:val="99"/>
     <w:pPr>
       <w:pBdr/>
@@ -15752,9 +15994,9 @@
       </w:tcPr>
     </w:tblStylePr>
   </w:style>
-  <w:style w:type="table" w:styleId="76">
+  <w:style w:type="table" w:styleId="765">
     <w:name w:val="List Table 2 - Accent 1"/>
-    <w:basedOn w:val="666"/>
+    <w:basedOn w:val="889"/>
     <w:uiPriority w:val="99"/>
     <w:pPr>
       <w:pBdr/>
@@ -15990,9 +16232,9 @@
       </w:tcPr>
     </w:tblStylePr>
   </w:style>
-  <w:style w:type="table" w:styleId="77">
+  <w:style w:type="table" w:styleId="766">
     <w:name w:val="List Table 2 - Accent 2"/>
-    <w:basedOn w:val="666"/>
+    <w:basedOn w:val="889"/>
     <w:uiPriority w:val="99"/>
     <w:pPr>
       <w:pBdr/>
@@ -16228,9 +16470,9 @@
       </w:tcPr>
     </w:tblStylePr>
   </w:style>
-  <w:style w:type="table" w:styleId="78">
+  <w:style w:type="table" w:styleId="767">
     <w:name w:val="List Table 2 - Accent 3"/>
-    <w:basedOn w:val="666"/>
+    <w:basedOn w:val="889"/>
     <w:uiPriority w:val="99"/>
     <w:pPr>
       <w:pBdr/>
@@ -16466,9 +16708,9 @@
       </w:tcPr>
     </w:tblStylePr>
   </w:style>
-  <w:style w:type="table" w:styleId="79">
+  <w:style w:type="table" w:styleId="768">
     <w:name w:val="List Table 2 - Accent 4"/>
-    <w:basedOn w:val="666"/>
+    <w:basedOn w:val="889"/>
     <w:uiPriority w:val="99"/>
     <w:pPr>
       <w:pBdr/>
@@ -16704,9 +16946,9 @@
       </w:tcPr>
     </w:tblStylePr>
   </w:style>
-  <w:style w:type="table" w:styleId="80">
+  <w:style w:type="table" w:styleId="769">
     <w:name w:val="List Table 2 - Accent 5"/>
-    <w:basedOn w:val="666"/>
+    <w:basedOn w:val="889"/>
     <w:uiPriority w:val="99"/>
     <w:pPr>
       <w:pBdr/>
@@ -16942,9 +17184,9 @@
       </w:tcPr>
     </w:tblStylePr>
   </w:style>
-  <w:style w:type="table" w:styleId="81">
+  <w:style w:type="table" w:styleId="770">
     <w:name w:val="List Table 2 - Accent 6"/>
-    <w:basedOn w:val="666"/>
+    <w:basedOn w:val="889"/>
     <w:uiPriority w:val="99"/>
     <w:pPr>
       <w:pBdr/>
@@ -17180,9 +17422,9 @@
       </w:tcPr>
     </w:tblStylePr>
   </w:style>
-  <w:style w:type="table" w:styleId="82">
+  <w:style w:type="table" w:styleId="771">
     <w:name w:val="List Table 3"/>
-    <w:basedOn w:val="666"/>
+    <w:basedOn w:val="889"/>
     <w:uiPriority w:val="99"/>
     <w:pPr>
       <w:pBdr/>
@@ -17408,9 +17650,9 @@
       </w:tcPr>
     </w:tblStylePr>
   </w:style>
-  <w:style w:type="table" w:styleId="83">
+  <w:style w:type="table" w:styleId="772">
     <w:name w:val="List Table 3 - Accent 1"/>
-    <w:basedOn w:val="666"/>
+    <w:basedOn w:val="889"/>
     <w:uiPriority w:val="99"/>
     <w:pPr>
       <w:pBdr/>
@@ -17636,9 +17878,9 @@
       </w:tcPr>
     </w:tblStylePr>
   </w:style>
-  <w:style w:type="table" w:styleId="84">
+  <w:style w:type="table" w:styleId="773">
     <w:name w:val="List Table 3 - Accent 2"/>
-    <w:basedOn w:val="666"/>
+    <w:basedOn w:val="889"/>
     <w:uiPriority w:val="99"/>
     <w:pPr>
       <w:pBdr/>
@@ -17864,9 +18106,9 @@
       </w:tcPr>
     </w:tblStylePr>
   </w:style>
-  <w:style w:type="table" w:styleId="85">
+  <w:style w:type="table" w:styleId="774">
     <w:name w:val="List Table 3 - Accent 3"/>
-    <w:basedOn w:val="666"/>
+    <w:basedOn w:val="889"/>
     <w:uiPriority w:val="99"/>
     <w:pPr>
       <w:pBdr/>
@@ -18092,9 +18334,9 @@
       </w:tcPr>
     </w:tblStylePr>
   </w:style>
-  <w:style w:type="table" w:styleId="86">
+  <w:style w:type="table" w:styleId="775">
     <w:name w:val="List Table 3 - Accent 4"/>
-    <w:basedOn w:val="666"/>
+    <w:basedOn w:val="889"/>
     <w:uiPriority w:val="99"/>
     <w:pPr>
       <w:pBdr/>
@@ -18320,9 +18562,9 @@
       </w:tcPr>
     </w:tblStylePr>
   </w:style>
-  <w:style w:type="table" w:styleId="87">
+  <w:style w:type="table" w:styleId="776">
     <w:name w:val="List Table 3 - Accent 5"/>
-    <w:basedOn w:val="666"/>
+    <w:basedOn w:val="889"/>
     <w:uiPriority w:val="99"/>
     <w:pPr>
       <w:pBdr/>
@@ -18548,9 +18790,9 @@
       </w:tcPr>
     </w:tblStylePr>
   </w:style>
-  <w:style w:type="table" w:styleId="88">
+  <w:style w:type="table" w:styleId="777">
     <w:name w:val="List Table 3 - Accent 6"/>
-    <w:basedOn w:val="666"/>
+    <w:basedOn w:val="889"/>
     <w:uiPriority w:val="99"/>
     <w:pPr>
       <w:pBdr/>
@@ -18776,9 +19018,9 @@
       </w:tcPr>
     </w:tblStylePr>
   </w:style>
-  <w:style w:type="table" w:styleId="89">
+  <w:style w:type="table" w:styleId="778">
     <w:name w:val="List Table 4"/>
-    <w:basedOn w:val="666"/>
+    <w:basedOn w:val="889"/>
     <w:uiPriority w:val="99"/>
     <w:pPr>
       <w:pBdr/>
@@ -19001,9 +19243,9 @@
       </w:tcPr>
     </w:tblStylePr>
   </w:style>
-  <w:style w:type="table" w:styleId="90">
+  <w:style w:type="table" w:styleId="779">
     <w:name w:val="List Table 4 - Accent 1"/>
-    <w:basedOn w:val="666"/>
+    <w:basedOn w:val="889"/>
     <w:uiPriority w:val="99"/>
     <w:pPr>
       <w:pBdr/>
@@ -19226,9 +19468,9 @@
       </w:tcPr>
     </w:tblStylePr>
   </w:style>
-  <w:style w:type="table" w:styleId="91">
+  <w:style w:type="table" w:styleId="780">
     <w:name w:val="List Table 4 - Accent 2"/>
-    <w:basedOn w:val="666"/>
+    <w:basedOn w:val="889"/>
     <w:uiPriority w:val="99"/>
     <w:pPr>
       <w:pBdr/>
@@ -19451,9 +19693,9 @@
       </w:tcPr>
     </w:tblStylePr>
   </w:style>
-  <w:style w:type="table" w:styleId="92">
+  <w:style w:type="table" w:styleId="781">
     <w:name w:val="List Table 4 - Accent 3"/>
-    <w:basedOn w:val="666"/>
+    <w:basedOn w:val="889"/>
     <w:uiPriority w:val="99"/>
     <w:pPr>
       <w:pBdr/>
@@ -19676,9 +19918,9 @@
       </w:tcPr>
     </w:tblStylePr>
   </w:style>
-  <w:style w:type="table" w:styleId="93">
+  <w:style w:type="table" w:styleId="782">
     <w:name w:val="List Table 4 - Accent 4"/>
-    <w:basedOn w:val="666"/>
+    <w:basedOn w:val="889"/>
     <w:uiPriority w:val="99"/>
     <w:pPr>
       <w:pBdr/>
@@ -19901,9 +20143,9 @@
       </w:tcPr>
     </w:tblStylePr>
   </w:style>
-  <w:style w:type="table" w:styleId="94">
+  <w:style w:type="table" w:styleId="783">
     <w:name w:val="List Table 4 - Accent 5"/>
-    <w:basedOn w:val="666"/>
+    <w:basedOn w:val="889"/>
     <w:uiPriority w:val="99"/>
     <w:pPr>
       <w:pBdr/>
@@ -20126,9 +20368,9 @@
       </w:tcPr>
     </w:tblStylePr>
   </w:style>
-  <w:style w:type="table" w:styleId="95">
+  <w:style w:type="table" w:styleId="784">
     <w:name w:val="List Table 4 - Accent 6"/>
-    <w:basedOn w:val="666"/>
+    <w:basedOn w:val="889"/>
     <w:uiPriority w:val="99"/>
     <w:pPr>
       <w:pBdr/>
@@ -20351,9 +20593,9 @@
       </w:tcPr>
     </w:tblStylePr>
   </w:style>
-  <w:style w:type="table" w:styleId="96">
+  <w:style w:type="table" w:styleId="785">
     <w:name w:val="List Table 5 Dark"/>
-    <w:basedOn w:val="666"/>
+    <w:basedOn w:val="889"/>
     <w:uiPriority w:val="99"/>
     <w:pPr>
       <w:pBdr/>
@@ -20593,9 +20835,9 @@
       </w:tcPr>
     </w:tblStylePr>
   </w:style>
-  <w:style w:type="table" w:styleId="97">
+  <w:style w:type="table" w:styleId="786">
     <w:name w:val="List Table 5 Dark - Accent 1"/>
-    <w:basedOn w:val="666"/>
+    <w:basedOn w:val="889"/>
     <w:uiPriority w:val="99"/>
     <w:pPr>
       <w:pBdr/>
@@ -20835,9 +21077,9 @@
       </w:tcPr>
     </w:tblStylePr>
   </w:style>
-  <w:style w:type="table" w:styleId="98">
+  <w:style w:type="table" w:styleId="787">
     <w:name w:val="List Table 5 Dark - Accent 2"/>
-    <w:basedOn w:val="666"/>
+    <w:basedOn w:val="889"/>
     <w:uiPriority w:val="99"/>
     <w:pPr>
       <w:pBdr/>
@@ -21077,9 +21319,9 @@
       </w:tcPr>
     </w:tblStylePr>
   </w:style>
-  <w:style w:type="table" w:styleId="99">
+  <w:style w:type="table" w:styleId="788">
     <w:name w:val="List Table 5 Dark - Accent 3"/>
-    <w:basedOn w:val="666"/>
+    <w:basedOn w:val="889"/>
     <w:uiPriority w:val="99"/>
     <w:pPr>
       <w:pBdr/>
@@ -21319,9 +21561,9 @@
       </w:tcPr>
     </w:tblStylePr>
   </w:style>
-  <w:style w:type="table" w:styleId="100">
+  <w:style w:type="table" w:styleId="789">
     <w:name w:val="List Table 5 Dark - Accent 4"/>
-    <w:basedOn w:val="666"/>
+    <w:basedOn w:val="889"/>
     <w:uiPriority w:val="99"/>
     <w:pPr>
       <w:pBdr/>
@@ -21561,9 +21803,9 @@
       </w:tcPr>
     </w:tblStylePr>
   </w:style>
-  <w:style w:type="table" w:styleId="101">
+  <w:style w:type="table" w:styleId="790">
     <w:name w:val="List Table 5 Dark - Accent 5"/>
-    <w:basedOn w:val="666"/>
+    <w:basedOn w:val="889"/>
     <w:uiPriority w:val="99"/>
     <w:pPr>
       <w:pBdr/>
@@ -21803,9 +22045,9 @@
       </w:tcPr>
     </w:tblStylePr>
   </w:style>
-  <w:style w:type="table" w:styleId="102">
+  <w:style w:type="table" w:styleId="791">
     <w:name w:val="List Table 5 Dark - Accent 6"/>
-    <w:basedOn w:val="666"/>
+    <w:basedOn w:val="889"/>
     <w:uiPriority w:val="99"/>
     <w:pPr>
       <w:pBdr/>
@@ -22045,9 +22287,9 @@
       </w:tcPr>
     </w:tblStylePr>
   </w:style>
-  <w:style w:type="table" w:styleId="103">
+  <w:style w:type="table" w:styleId="792">
     <w:name w:val="List Table 6 Colorful"/>
-    <w:basedOn w:val="666"/>
+    <w:basedOn w:val="889"/>
     <w:uiPriority w:val="99"/>
     <w:pPr>
       <w:pBdr/>
@@ -22268,9 +22510,9 @@
       </w:tcPr>
     </w:tblStylePr>
   </w:style>
-  <w:style w:type="table" w:styleId="104">
+  <w:style w:type="table" w:styleId="793">
     <w:name w:val="List Table 6 Colorful - Accent 1"/>
-    <w:basedOn w:val="666"/>
+    <w:basedOn w:val="889"/>
     <w:uiPriority w:val="99"/>
     <w:pPr>
       <w:pBdr/>
@@ -22491,9 +22733,9 @@
       </w:tcPr>
     </w:tblStylePr>
   </w:style>
-  <w:style w:type="table" w:styleId="105">
+  <w:style w:type="table" w:styleId="794">
     <w:name w:val="List Table 6 Colorful - Accent 2"/>
-    <w:basedOn w:val="666"/>
+    <w:basedOn w:val="889"/>
     <w:uiPriority w:val="99"/>
     <w:pPr>
       <w:pBdr/>
@@ -22714,9 +22956,9 @@
       </w:tcPr>
     </w:tblStylePr>
   </w:style>
-  <w:style w:type="table" w:styleId="106">
+  <w:style w:type="table" w:styleId="795">
     <w:name w:val="List Table 6 Colorful - Accent 3"/>
-    <w:basedOn w:val="666"/>
+    <w:basedOn w:val="889"/>
     <w:uiPriority w:val="99"/>
     <w:pPr>
       <w:pBdr/>
@@ -22937,9 +23179,9 @@
       </w:tcPr>
     </w:tblStylePr>
   </w:style>
-  <w:style w:type="table" w:styleId="107">
+  <w:style w:type="table" w:styleId="796">
     <w:name w:val="List Table 6 Colorful - Accent 4"/>
-    <w:basedOn w:val="666"/>
+    <w:basedOn w:val="889"/>
     <w:uiPriority w:val="99"/>
     <w:pPr>
       <w:pBdr/>
@@ -23160,9 +23402,9 @@
       </w:tcPr>
     </w:tblStylePr>
   </w:style>
-  <w:style w:type="table" w:styleId="108">
+  <w:style w:type="table" w:styleId="797">
     <w:name w:val="List Table 6 Colorful - Accent 5"/>
-    <w:basedOn w:val="666"/>
+    <w:basedOn w:val="889"/>
     <w:uiPriority w:val="99"/>
     <w:pPr>
       <w:pBdr/>
@@ -23383,9 +23625,9 @@
       </w:tcPr>
     </w:tblStylePr>
   </w:style>
-  <w:style w:type="table" w:styleId="109">
+  <w:style w:type="table" w:styleId="798">
     <w:name w:val="List Table 6 Colorful - Accent 6"/>
-    <w:basedOn w:val="666"/>
+    <w:basedOn w:val="889"/>
     <w:uiPriority w:val="99"/>
     <w:pPr>
       <w:pBdr/>
@@ -23606,9 +23848,9 @@
       </w:tcPr>
     </w:tblStylePr>
   </w:style>
-  <w:style w:type="table" w:styleId="110">
+  <w:style w:type="table" w:styleId="799">
     <w:name w:val="List Table 7 Colorful"/>
-    <w:basedOn w:val="666"/>
+    <w:basedOn w:val="889"/>
     <w:uiPriority w:val="99"/>
     <w:pPr>
       <w:pBdr/>
@@ -23707,11 +23949,11 @@
         <w:tblBorders/>
       </w:tblPr>
       <w:tcPr>
-        <w:shd w:color="ffffff"/>
+        <w:shd w:val="clear" w:color="ffffff"/>
         <w:tcBorders>
-          <w:top w:val="none"/>
-          <w:left w:val="none"/>
-          <w:bottom w:val="none"/>
+          <w:top w:val="none" w:color="000000" w:sz="4" w:space="0"/>
+          <w:left w:val="none" w:color="000000" w:sz="4" w:space="0"/>
+          <w:bottom w:val="none" w:color="000000" w:sz="4" w:space="0"/>
           <w:right w:val="single" w:color="000000" w:themeColor="text1" w:themeTint="80" w:sz="4" w:space="0"/>
         </w:tcBorders>
       </w:tcPr>
@@ -23734,10 +23976,10 @@
       <w:tcPr>
         <w:shd w:val="clear" w:color="ffffff" w:themeColor="light1" w:fill="ffffff" w:themeFill="light1"/>
         <w:tcBorders>
-          <w:top w:val="none"/>
-          <w:left w:val="none"/>
+          <w:top w:val="none" w:color="000000" w:sz="4" w:space="0"/>
+          <w:left w:val="none" w:color="000000" w:sz="4" w:space="0"/>
           <w:bottom w:val="single" w:color="000000" w:themeColor="text1" w:themeTint="80" w:sz="4" w:space="0"/>
-          <w:right w:val="none"/>
+          <w:right w:val="none" w:color="000000" w:sz="4" w:space="0"/>
         </w:tcBorders>
       </w:tcPr>
     </w:tblStylePr>
@@ -23757,12 +23999,12 @@
         <w:tblBorders/>
       </w:tblPr>
       <w:tcPr>
-        <w:shd w:color="ffffff"/>
+        <w:shd w:val="clear" w:color="ffffff"/>
         <w:tcBorders>
-          <w:top w:val="none"/>
+          <w:top w:val="none" w:color="000000" w:sz="4" w:space="0"/>
           <w:left w:val="single" w:color="000000" w:themeColor="text1" w:themeTint="80" w:sz="4" w:space="0"/>
-          <w:bottom w:val="none"/>
-          <w:right w:val="none"/>
+          <w:bottom w:val="none" w:color="000000" w:sz="4" w:space="0"/>
+          <w:right w:val="none" w:color="000000" w:sz="4" w:space="0"/>
         </w:tcBorders>
       </w:tcPr>
     </w:tblStylePr>
@@ -23785,9 +24027,9 @@
         <w:shd w:val="clear" w:color="ffffff" w:themeColor="light1" w:fill="ffffff" w:themeFill="light1"/>
         <w:tcBorders>
           <w:top w:val="single" w:color="000000" w:themeColor="text1" w:themeTint="80" w:sz="4" w:space="0"/>
-          <w:left w:val="none"/>
-          <w:bottom w:val="none"/>
-          <w:right w:val="none"/>
+          <w:left w:val="none" w:color="000000" w:sz="4" w:space="0"/>
+          <w:bottom w:val="none" w:color="000000" w:sz="4" w:space="0"/>
+          <w:right w:val="none" w:color="000000" w:sz="4" w:space="0"/>
         </w:tcBorders>
       </w:tcPr>
     </w:tblStylePr>
@@ -23862,9 +24104,9 @@
       </w:tcPr>
     </w:tblStylePr>
   </w:style>
-  <w:style w:type="table" w:styleId="111">
+  <w:style w:type="table" w:styleId="800">
     <w:name w:val="List Table 7 Colorful - Accent 1"/>
-    <w:basedOn w:val="666"/>
+    <w:basedOn w:val="889"/>
     <w:uiPriority w:val="99"/>
     <w:pPr>
       <w:pBdr/>
@@ -23963,11 +24205,11 @@
         <w:tblBorders/>
       </w:tblPr>
       <w:tcPr>
-        <w:shd w:color="ffffff"/>
+        <w:shd w:val="clear" w:color="ffffff"/>
         <w:tcBorders>
-          <w:top w:val="none"/>
-          <w:left w:val="none"/>
-          <w:bottom w:val="none"/>
+          <w:top w:val="none" w:color="000000" w:sz="4" w:space="0"/>
+          <w:left w:val="none" w:color="000000" w:sz="4" w:space="0"/>
+          <w:bottom w:val="none" w:color="000000" w:sz="4" w:space="0"/>
           <w:right w:val="single" w:color="000000" w:themeColor="accent1" w:sz="4" w:space="0"/>
         </w:tcBorders>
       </w:tcPr>
@@ -23990,10 +24232,10 @@
       <w:tcPr>
         <w:shd w:val="clear" w:color="ffffff" w:themeColor="light1" w:fill="ffffff" w:themeFill="light1"/>
         <w:tcBorders>
-          <w:top w:val="none"/>
-          <w:left w:val="none"/>
+          <w:top w:val="none" w:color="000000" w:sz="4" w:space="0"/>
+          <w:left w:val="none" w:color="000000" w:sz="4" w:space="0"/>
           <w:bottom w:val="single" w:color="000000" w:themeColor="accent1" w:sz="4" w:space="0"/>
-          <w:right w:val="none"/>
+          <w:right w:val="none" w:color="000000" w:sz="4" w:space="0"/>
         </w:tcBorders>
       </w:tcPr>
     </w:tblStylePr>
@@ -24013,12 +24255,12 @@
         <w:tblBorders/>
       </w:tblPr>
       <w:tcPr>
-        <w:shd w:color="ffffff"/>
+        <w:shd w:val="clear" w:color="ffffff"/>
         <w:tcBorders>
-          <w:top w:val="none"/>
+          <w:top w:val="none" w:color="000000" w:sz="4" w:space="0"/>
           <w:left w:val="single" w:color="000000" w:themeColor="accent1" w:sz="4" w:space="0"/>
-          <w:bottom w:val="none"/>
-          <w:right w:val="none"/>
+          <w:bottom w:val="none" w:color="000000" w:sz="4" w:space="0"/>
+          <w:right w:val="none" w:color="000000" w:sz="4" w:space="0"/>
         </w:tcBorders>
       </w:tcPr>
     </w:tblStylePr>
@@ -24041,9 +24283,9 @@
         <w:shd w:val="clear" w:color="ffffff" w:themeColor="light1" w:fill="ffffff" w:themeFill="light1"/>
         <w:tcBorders>
           <w:top w:val="single" w:color="000000" w:themeColor="accent1" w:sz="4" w:space="0"/>
-          <w:left w:val="none"/>
-          <w:bottom w:val="none"/>
-          <w:right w:val="none"/>
+          <w:left w:val="none" w:color="000000" w:sz="4" w:space="0"/>
+          <w:bottom w:val="none" w:color="000000" w:sz="4" w:space="0"/>
+          <w:right w:val="none" w:color="000000" w:sz="4" w:space="0"/>
         </w:tcBorders>
       </w:tcPr>
     </w:tblStylePr>
@@ -24118,9 +24360,9 @@
       </w:tcPr>
     </w:tblStylePr>
   </w:style>
-  <w:style w:type="table" w:styleId="112">
+  <w:style w:type="table" w:styleId="801">
     <w:name w:val="List Table 7 Colorful - Accent 2"/>
-    <w:basedOn w:val="666"/>
+    <w:basedOn w:val="889"/>
     <w:uiPriority w:val="99"/>
     <w:pPr>
       <w:pBdr/>
@@ -24219,11 +24461,11 @@
         <w:tblBorders/>
       </w:tblPr>
       <w:tcPr>
-        <w:shd w:color="ffffff"/>
+        <w:shd w:val="clear" w:color="ffffff"/>
         <w:tcBorders>
-          <w:top w:val="none"/>
-          <w:left w:val="none"/>
-          <w:bottom w:val="none"/>
+          <w:top w:val="none" w:color="000000" w:sz="4" w:space="0"/>
+          <w:left w:val="none" w:color="000000" w:sz="4" w:space="0"/>
+          <w:bottom w:val="none" w:color="000000" w:sz="4" w:space="0"/>
           <w:right w:val="single" w:color="000000" w:themeColor="accent2" w:themeTint="97" w:sz="4" w:space="0"/>
         </w:tcBorders>
       </w:tcPr>
@@ -24246,10 +24488,10 @@
       <w:tcPr>
         <w:shd w:val="clear" w:color="ffffff" w:themeColor="light1" w:fill="ffffff" w:themeFill="light1"/>
         <w:tcBorders>
-          <w:top w:val="none"/>
-          <w:left w:val="none"/>
+          <w:top w:val="none" w:color="000000" w:sz="4" w:space="0"/>
+          <w:left w:val="none" w:color="000000" w:sz="4" w:space="0"/>
           <w:bottom w:val="single" w:color="000000" w:themeColor="accent2" w:themeTint="97" w:sz="4" w:space="0"/>
-          <w:right w:val="none"/>
+          <w:right w:val="none" w:color="000000" w:sz="4" w:space="0"/>
         </w:tcBorders>
       </w:tcPr>
     </w:tblStylePr>
@@ -24269,12 +24511,12 @@
         <w:tblBorders/>
       </w:tblPr>
       <w:tcPr>
-        <w:shd w:color="ffffff"/>
+        <w:shd w:val="clear" w:color="ffffff"/>
         <w:tcBorders>
-          <w:top w:val="none"/>
+          <w:top w:val="none" w:color="000000" w:sz="4" w:space="0"/>
           <w:left w:val="single" w:color="000000" w:themeColor="accent2" w:themeTint="97" w:sz="4" w:space="0"/>
-          <w:bottom w:val="none"/>
-          <w:right w:val="none"/>
+          <w:bottom w:val="none" w:color="000000" w:sz="4" w:space="0"/>
+          <w:right w:val="none" w:color="000000" w:sz="4" w:space="0"/>
         </w:tcBorders>
       </w:tcPr>
     </w:tblStylePr>
@@ -24297,9 +24539,9 @@
         <w:shd w:val="clear" w:color="ffffff" w:themeColor="light1" w:fill="ffffff" w:themeFill="light1"/>
         <w:tcBorders>
           <w:top w:val="single" w:color="000000" w:themeColor="accent2" w:themeTint="97" w:sz="4" w:space="0"/>
-          <w:left w:val="none"/>
-          <w:bottom w:val="none"/>
-          <w:right w:val="none"/>
+          <w:left w:val="none" w:color="000000" w:sz="4" w:space="0"/>
+          <w:bottom w:val="none" w:color="000000" w:sz="4" w:space="0"/>
+          <w:right w:val="none" w:color="000000" w:sz="4" w:space="0"/>
         </w:tcBorders>
       </w:tcPr>
     </w:tblStylePr>
@@ -24374,9 +24616,9 @@
       </w:tcPr>
     </w:tblStylePr>
   </w:style>
-  <w:style w:type="table" w:styleId="113">
+  <w:style w:type="table" w:styleId="802">
     <w:name w:val="List Table 7 Colorful - Accent 3"/>
-    <w:basedOn w:val="666"/>
+    <w:basedOn w:val="889"/>
     <w:uiPriority w:val="99"/>
     <w:pPr>
       <w:pBdr/>
@@ -24475,11 +24717,11 @@
         <w:tblBorders/>
       </w:tblPr>
       <w:tcPr>
-        <w:shd w:color="ffffff"/>
+        <w:shd w:val="clear" w:color="ffffff"/>
         <w:tcBorders>
-          <w:top w:val="none"/>
-          <w:left w:val="none"/>
-          <w:bottom w:val="none"/>
+          <w:top w:val="none" w:color="000000" w:sz="4" w:space="0"/>
+          <w:left w:val="none" w:color="000000" w:sz="4" w:space="0"/>
+          <w:bottom w:val="none" w:color="000000" w:sz="4" w:space="0"/>
           <w:right w:val="single" w:color="000000" w:themeColor="accent3" w:themeTint="98" w:sz="4" w:space="0"/>
         </w:tcBorders>
       </w:tcPr>
@@ -24502,10 +24744,10 @@
       <w:tcPr>
         <w:shd w:val="clear" w:color="ffffff" w:themeColor="light1" w:fill="ffffff" w:themeFill="light1"/>
         <w:tcBorders>
-          <w:top w:val="none"/>
-          <w:left w:val="none"/>
+          <w:top w:val="none" w:color="000000" w:sz="4" w:space="0"/>
+          <w:left w:val="none" w:color="000000" w:sz="4" w:space="0"/>
           <w:bottom w:val="single" w:color="000000" w:themeColor="accent3" w:themeTint="98" w:sz="4" w:space="0"/>
-          <w:right w:val="none"/>
+          <w:right w:val="none" w:color="000000" w:sz="4" w:space="0"/>
         </w:tcBorders>
       </w:tcPr>
     </w:tblStylePr>
@@ -24525,12 +24767,12 @@
         <w:tblBorders/>
       </w:tblPr>
       <w:tcPr>
-        <w:shd w:color="ffffff"/>
+        <w:shd w:val="clear" w:color="ffffff"/>
         <w:tcBorders>
-          <w:top w:val="none"/>
+          <w:top w:val="none" w:color="000000" w:sz="4" w:space="0"/>
           <w:left w:val="single" w:color="000000" w:themeColor="accent3" w:themeTint="98" w:sz="4" w:space="0"/>
-          <w:bottom w:val="none"/>
-          <w:right w:val="none"/>
+          <w:bottom w:val="none" w:color="000000" w:sz="4" w:space="0"/>
+          <w:right w:val="none" w:color="000000" w:sz="4" w:space="0"/>
         </w:tcBorders>
       </w:tcPr>
     </w:tblStylePr>
@@ -24553,9 +24795,9 @@
         <w:shd w:val="clear" w:color="ffffff" w:themeColor="light1" w:fill="ffffff" w:themeFill="light1"/>
         <w:tcBorders>
           <w:top w:val="single" w:color="000000" w:themeColor="accent3" w:themeTint="98" w:sz="4" w:space="0"/>
-          <w:left w:val="none"/>
-          <w:bottom w:val="none"/>
-          <w:right w:val="none"/>
+          <w:left w:val="none" w:color="000000" w:sz="4" w:space="0"/>
+          <w:bottom w:val="none" w:color="000000" w:sz="4" w:space="0"/>
+          <w:right w:val="none" w:color="000000" w:sz="4" w:space="0"/>
         </w:tcBorders>
       </w:tcPr>
     </w:tblStylePr>
@@ -24630,9 +24872,9 @@
       </w:tcPr>
     </w:tblStylePr>
   </w:style>
-  <w:style w:type="table" w:styleId="114">
+  <w:style w:type="table" w:styleId="803">
     <w:name w:val="List Table 7 Colorful - Accent 4"/>
-    <w:basedOn w:val="666"/>
+    <w:basedOn w:val="889"/>
     <w:uiPriority w:val="99"/>
     <w:pPr>
       <w:pBdr/>
@@ -24731,11 +24973,11 @@
         <w:tblBorders/>
       </w:tblPr>
       <w:tcPr>
-        <w:shd w:color="ffffff"/>
+        <w:shd w:val="clear" w:color="ffffff"/>
         <w:tcBorders>
-          <w:top w:val="none"/>
-          <w:left w:val="none"/>
-          <w:bottom w:val="none"/>
+          <w:top w:val="none" w:color="000000" w:sz="4" w:space="0"/>
+          <w:left w:val="none" w:color="000000" w:sz="4" w:space="0"/>
+          <w:bottom w:val="none" w:color="000000" w:sz="4" w:space="0"/>
           <w:right w:val="single" w:color="000000" w:themeColor="accent4" w:themeTint="9A" w:sz="4" w:space="0"/>
         </w:tcBorders>
       </w:tcPr>
@@ -24758,10 +25000,10 @@
       <w:tcPr>
         <w:shd w:val="clear" w:color="ffffff" w:themeColor="light1" w:fill="ffffff" w:themeFill="light1"/>
         <w:tcBorders>
-          <w:top w:val="none"/>
-          <w:left w:val="none"/>
+          <w:top w:val="none" w:color="000000" w:sz="4" w:space="0"/>
+          <w:left w:val="none" w:color="000000" w:sz="4" w:space="0"/>
           <w:bottom w:val="single" w:color="000000" w:themeColor="accent4" w:themeTint="9A" w:sz="4" w:space="0"/>
-          <w:right w:val="none"/>
+          <w:right w:val="none" w:color="000000" w:sz="4" w:space="0"/>
         </w:tcBorders>
       </w:tcPr>
     </w:tblStylePr>
@@ -24781,12 +25023,12 @@
         <w:tblBorders/>
       </w:tblPr>
       <w:tcPr>
-        <w:shd w:color="ffffff"/>
+        <w:shd w:val="clear" w:color="ffffff"/>
         <w:tcBorders>
-          <w:top w:val="none"/>
+          <w:top w:val="none" w:color="000000" w:sz="4" w:space="0"/>
           <w:left w:val="single" w:color="000000" w:themeColor="accent4" w:themeTint="9A" w:sz="4" w:space="0"/>
-          <w:bottom w:val="none"/>
-          <w:right w:val="none"/>
+          <w:bottom w:val="none" w:color="000000" w:sz="4" w:space="0"/>
+          <w:right w:val="none" w:color="000000" w:sz="4" w:space="0"/>
         </w:tcBorders>
       </w:tcPr>
     </w:tblStylePr>
@@ -24809,9 +25051,9 @@
         <w:shd w:val="clear" w:color="ffffff" w:themeColor="light1" w:fill="ffffff" w:themeFill="light1"/>
         <w:tcBorders>
           <w:top w:val="single" w:color="000000" w:themeColor="accent4" w:themeTint="9A" w:sz="4" w:space="0"/>
-          <w:left w:val="none"/>
-          <w:bottom w:val="none"/>
-          <w:right w:val="none"/>
+          <w:left w:val="none" w:color="000000" w:sz="4" w:space="0"/>
+          <w:bottom w:val="none" w:color="000000" w:sz="4" w:space="0"/>
+          <w:right w:val="none" w:color="000000" w:sz="4" w:space="0"/>
         </w:tcBorders>
       </w:tcPr>
     </w:tblStylePr>
@@ -24886,9 +25128,9 @@
       </w:tcPr>
     </w:tblStylePr>
   </w:style>
-  <w:style w:type="table" w:styleId="115">
+  <w:style w:type="table" w:styleId="804">
     <w:name w:val="List Table 7 Colorful - Accent 5"/>
-    <w:basedOn w:val="666"/>
+    <w:basedOn w:val="889"/>
     <w:uiPriority w:val="99"/>
     <w:pPr>
       <w:pBdr/>
@@ -24987,11 +25229,11 @@
         <w:tblBorders/>
       </w:tblPr>
       <w:tcPr>
-        <w:shd w:color="ffffff"/>
+        <w:shd w:val="clear" w:color="ffffff"/>
         <w:tcBorders>
-          <w:top w:val="none"/>
-          <w:left w:val="none"/>
-          <w:bottom w:val="none"/>
+          <w:top w:val="none" w:color="000000" w:sz="4" w:space="0"/>
+          <w:left w:val="none" w:color="000000" w:sz="4" w:space="0"/>
+          <w:bottom w:val="none" w:color="000000" w:sz="4" w:space="0"/>
           <w:right w:val="single" w:color="000000" w:themeColor="accent5" w:themeTint="9A" w:sz="4" w:space="0"/>
         </w:tcBorders>
       </w:tcPr>
@@ -25014,10 +25256,10 @@
       <w:tcPr>
         <w:shd w:val="clear" w:color="ffffff" w:themeColor="light1" w:fill="ffffff" w:themeFill="light1"/>
         <w:tcBorders>
-          <w:top w:val="none"/>
-          <w:left w:val="none"/>
+          <w:top w:val="none" w:color="000000" w:sz="4" w:space="0"/>
+          <w:left w:val="none" w:color="000000" w:sz="4" w:space="0"/>
           <w:bottom w:val="single" w:color="000000" w:themeColor="accent5" w:themeTint="9A" w:sz="4" w:space="0"/>
-          <w:right w:val="none"/>
+          <w:right w:val="none" w:color="000000" w:sz="4" w:space="0"/>
         </w:tcBorders>
       </w:tcPr>
     </w:tblStylePr>
@@ -25037,12 +25279,12 @@
         <w:tblBorders/>
       </w:tblPr>
       <w:tcPr>
-        <w:shd w:color="ffffff"/>
+        <w:shd w:val="clear" w:color="ffffff"/>
         <w:tcBorders>
-          <w:top w:val="none"/>
+          <w:top w:val="none" w:color="000000" w:sz="4" w:space="0"/>
           <w:left w:val="single" w:color="000000" w:themeColor="accent5" w:themeTint="9A" w:sz="4" w:space="0"/>
-          <w:bottom w:val="none"/>
-          <w:right w:val="none"/>
+          <w:bottom w:val="none" w:color="000000" w:sz="4" w:space="0"/>
+          <w:right w:val="none" w:color="000000" w:sz="4" w:space="0"/>
         </w:tcBorders>
       </w:tcPr>
     </w:tblStylePr>
@@ -25065,9 +25307,9 @@
         <w:shd w:val="clear" w:color="ffffff" w:themeColor="light1" w:fill="ffffff" w:themeFill="light1"/>
         <w:tcBorders>
           <w:top w:val="single" w:color="000000" w:themeColor="accent5" w:themeTint="9A" w:sz="4" w:space="0"/>
-          <w:left w:val="none"/>
-          <w:bottom w:val="none"/>
-          <w:right w:val="none"/>
+          <w:left w:val="none" w:color="000000" w:sz="4" w:space="0"/>
+          <w:bottom w:val="none" w:color="000000" w:sz="4" w:space="0"/>
+          <w:right w:val="none" w:color="000000" w:sz="4" w:space="0"/>
         </w:tcBorders>
       </w:tcPr>
     </w:tblStylePr>
@@ -25142,9 +25384,9 @@
       </w:tcPr>
     </w:tblStylePr>
   </w:style>
-  <w:style w:type="table" w:styleId="116">
+  <w:style w:type="table" w:styleId="805">
     <w:name w:val="List Table 7 Colorful - Accent 6"/>
-    <w:basedOn w:val="666"/>
+    <w:basedOn w:val="889"/>
     <w:uiPriority w:val="99"/>
     <w:pPr>
       <w:pBdr/>
@@ -25243,11 +25485,11 @@
         <w:tblBorders/>
       </w:tblPr>
       <w:tcPr>
-        <w:shd w:color="ffffff"/>
+        <w:shd w:val="clear" w:color="ffffff"/>
         <w:tcBorders>
-          <w:top w:val="none"/>
-          <w:left w:val="none"/>
-          <w:bottom w:val="none"/>
+          <w:top w:val="none" w:color="000000" w:sz="4" w:space="0"/>
+          <w:left w:val="none" w:color="000000" w:sz="4" w:space="0"/>
+          <w:bottom w:val="none" w:color="000000" w:sz="4" w:space="0"/>
           <w:right w:val="single" w:color="000000" w:themeColor="accent6" w:themeTint="98" w:sz="4" w:space="0"/>
         </w:tcBorders>
       </w:tcPr>
@@ -25270,10 +25512,10 @@
       <w:tcPr>
         <w:shd w:val="clear" w:color="ffffff" w:themeColor="light1" w:fill="ffffff" w:themeFill="light1"/>
         <w:tcBorders>
-          <w:top w:val="none"/>
-          <w:left w:val="none"/>
+          <w:top w:val="none" w:color="000000" w:sz="4" w:space="0"/>
+          <w:left w:val="none" w:color="000000" w:sz="4" w:space="0"/>
           <w:bottom w:val="single" w:color="000000" w:themeColor="accent6" w:themeTint="98" w:sz="4" w:space="0"/>
-          <w:right w:val="none"/>
+          <w:right w:val="none" w:color="000000" w:sz="4" w:space="0"/>
         </w:tcBorders>
       </w:tcPr>
     </w:tblStylePr>
@@ -25293,12 +25535,12 @@
         <w:tblBorders/>
       </w:tblPr>
       <w:tcPr>
-        <w:shd w:color="ffffff"/>
+        <w:shd w:val="clear" w:color="ffffff"/>
         <w:tcBorders>
-          <w:top w:val="none"/>
+          <w:top w:val="none" w:color="000000" w:sz="4" w:space="0"/>
           <w:left w:val="single" w:color="000000" w:themeColor="accent6" w:themeTint="98" w:sz="4" w:space="0"/>
-          <w:bottom w:val="none"/>
-          <w:right w:val="none"/>
+          <w:bottom w:val="none" w:color="000000" w:sz="4" w:space="0"/>
+          <w:right w:val="none" w:color="000000" w:sz="4" w:space="0"/>
         </w:tcBorders>
       </w:tcPr>
     </w:tblStylePr>
@@ -25321,9 +25563,9 @@
         <w:shd w:val="clear" w:color="ffffff" w:themeColor="light1" w:fill="ffffff" w:themeFill="light1"/>
         <w:tcBorders>
           <w:top w:val="single" w:color="000000" w:themeColor="accent6" w:themeTint="98" w:sz="4" w:space="0"/>
-          <w:left w:val="none"/>
-          <w:bottom w:val="none"/>
-          <w:right w:val="none"/>
+          <w:left w:val="none" w:color="000000" w:sz="4" w:space="0"/>
+          <w:bottom w:val="none" w:color="000000" w:sz="4" w:space="0"/>
+          <w:right w:val="none" w:color="000000" w:sz="4" w:space="0"/>
         </w:tcBorders>
       </w:tcPr>
     </w:tblStylePr>
@@ -25398,9 +25640,9 @@
       </w:tcPr>
     </w:tblStylePr>
   </w:style>
-  <w:style w:type="table" w:styleId="117">
+  <w:style w:type="table" w:styleId="806">
     <w:name w:val="Lined - Accent"/>
-    <w:basedOn w:val="666"/>
+    <w:basedOn w:val="889"/>
     <w:uiPriority w:val="99"/>
     <w:pPr>
       <w:pBdr/>
@@ -25635,9 +25877,9 @@
       </w:tcPr>
     </w:tblStylePr>
   </w:style>
-  <w:style w:type="table" w:styleId="118">
+  <w:style w:type="table" w:styleId="807">
     <w:name w:val="Lined - Accent 1"/>
-    <w:basedOn w:val="666"/>
+    <w:basedOn w:val="889"/>
     <w:uiPriority w:val="99"/>
     <w:pPr>
       <w:pBdr/>
@@ -25872,9 +26114,9 @@
       </w:tcPr>
     </w:tblStylePr>
   </w:style>
-  <w:style w:type="table" w:styleId="119">
+  <w:style w:type="table" w:styleId="808">
     <w:name w:val="Lined - Accent 2"/>
-    <w:basedOn w:val="666"/>
+    <w:basedOn w:val="889"/>
     <w:uiPriority w:val="99"/>
     <w:pPr>
       <w:pBdr/>
@@ -26109,9 +26351,9 @@
       </w:tcPr>
     </w:tblStylePr>
   </w:style>
-  <w:style w:type="table" w:styleId="120">
+  <w:style w:type="table" w:styleId="809">
     <w:name w:val="Lined - Accent 3"/>
-    <w:basedOn w:val="666"/>
+    <w:basedOn w:val="889"/>
     <w:uiPriority w:val="99"/>
     <w:pPr>
       <w:pBdr/>
@@ -26346,9 +26588,9 @@
       </w:tcPr>
     </w:tblStylePr>
   </w:style>
-  <w:style w:type="table" w:styleId="121">
+  <w:style w:type="table" w:styleId="810">
     <w:name w:val="Lined - Accent 4"/>
-    <w:basedOn w:val="666"/>
+    <w:basedOn w:val="889"/>
     <w:uiPriority w:val="99"/>
     <w:pPr>
       <w:pBdr/>
@@ -26583,9 +26825,9 @@
       </w:tcPr>
     </w:tblStylePr>
   </w:style>
-  <w:style w:type="table" w:styleId="122">
+  <w:style w:type="table" w:styleId="811">
     <w:name w:val="Lined - Accent 5"/>
-    <w:basedOn w:val="666"/>
+    <w:basedOn w:val="889"/>
     <w:uiPriority w:val="99"/>
     <w:pPr>
       <w:pBdr/>
@@ -26820,9 +27062,9 @@
       </w:tcPr>
     </w:tblStylePr>
   </w:style>
-  <w:style w:type="table" w:styleId="123">
+  <w:style w:type="table" w:styleId="812">
     <w:name w:val="Lined - Accent 6"/>
-    <w:basedOn w:val="666"/>
+    <w:basedOn w:val="889"/>
     <w:uiPriority w:val="99"/>
     <w:pPr>
       <w:pBdr/>
@@ -27057,9 +27299,9 @@
       </w:tcPr>
     </w:tblStylePr>
   </w:style>
-  <w:style w:type="table" w:styleId="124">
+  <w:style w:type="table" w:styleId="813">
     <w:name w:val="Bordered &amp; Lined - Accent"/>
-    <w:basedOn w:val="666"/>
+    <w:basedOn w:val="889"/>
     <w:uiPriority w:val="99"/>
     <w:pPr>
       <w:pBdr/>
@@ -27301,9 +27543,9 @@
       </w:tcPr>
     </w:tblStylePr>
   </w:style>
-  <w:style w:type="table" w:styleId="125">
+  <w:style w:type="table" w:styleId="814">
     <w:name w:val="Bordered &amp; Lined - Accent 1"/>
-    <w:basedOn w:val="666"/>
+    <w:basedOn w:val="889"/>
     <w:uiPriority w:val="99"/>
     <w:pPr>
       <w:pBdr/>
@@ -27545,9 +27787,9 @@
       </w:tcPr>
     </w:tblStylePr>
   </w:style>
-  <w:style w:type="table" w:styleId="126">
+  <w:style w:type="table" w:styleId="815">
     <w:name w:val="Bordered &amp; Lined - Accent 2"/>
-    <w:basedOn w:val="666"/>
+    <w:basedOn w:val="889"/>
     <w:uiPriority w:val="99"/>
     <w:pPr>
       <w:pBdr/>
@@ -27789,9 +28031,9 @@
       </w:tcPr>
     </w:tblStylePr>
   </w:style>
-  <w:style w:type="table" w:styleId="127">
+  <w:style w:type="table" w:styleId="816">
     <w:name w:val="Bordered &amp; Lined - Accent 3"/>
-    <w:basedOn w:val="666"/>
+    <w:basedOn w:val="889"/>
     <w:uiPriority w:val="99"/>
     <w:pPr>
       <w:pBdr/>
@@ -28033,9 +28275,9 @@
       </w:tcPr>
     </w:tblStylePr>
   </w:style>
-  <w:style w:type="table" w:styleId="128">
+  <w:style w:type="table" w:styleId="817">
     <w:name w:val="Bordered &amp; Lined - Accent 4"/>
-    <w:basedOn w:val="666"/>
+    <w:basedOn w:val="889"/>
     <w:uiPriority w:val="99"/>
     <w:pPr>
       <w:pBdr/>
@@ -28277,9 +28519,9 @@
       </w:tcPr>
     </w:tblStylePr>
   </w:style>
-  <w:style w:type="table" w:styleId="129">
+  <w:style w:type="table" w:styleId="818">
     <w:name w:val="Bordered &amp; Lined - Accent 5"/>
-    <w:basedOn w:val="666"/>
+    <w:basedOn w:val="889"/>
     <w:uiPriority w:val="99"/>
     <w:pPr>
       <w:pBdr/>
@@ -28521,9 +28763,9 @@
       </w:tcPr>
     </w:tblStylePr>
   </w:style>
-  <w:style w:type="table" w:styleId="130">
+  <w:style w:type="table" w:styleId="819">
     <w:name w:val="Bordered &amp; Lined - Accent 6"/>
-    <w:basedOn w:val="666"/>
+    <w:basedOn w:val="889"/>
     <w:uiPriority w:val="99"/>
     <w:pPr>
       <w:pBdr/>
@@ -28765,9 +29007,9 @@
       </w:tcPr>
     </w:tblStylePr>
   </w:style>
-  <w:style w:type="table" w:styleId="131">
+  <w:style w:type="table" w:styleId="820">
     <w:name w:val="Bordered"/>
-    <w:basedOn w:val="666"/>
+    <w:basedOn w:val="889"/>
     <w:uiPriority w:val="99"/>
     <w:pPr>
       <w:pBdr/>
@@ -28996,9 +29238,9 @@
       </w:tcPr>
     </w:tblStylePr>
   </w:style>
-  <w:style w:type="table" w:styleId="132">
+  <w:style w:type="table" w:styleId="821">
     <w:name w:val="Bordered - Accent 1"/>
-    <w:basedOn w:val="666"/>
+    <w:basedOn w:val="889"/>
     <w:uiPriority w:val="99"/>
     <w:pPr>
       <w:pBdr/>
@@ -29227,9 +29469,9 @@
       </w:tcPr>
     </w:tblStylePr>
   </w:style>
-  <w:style w:type="table" w:styleId="133">
+  <w:style w:type="table" w:styleId="822">
     <w:name w:val="Bordered - Accent 2"/>
-    <w:basedOn w:val="666"/>
+    <w:basedOn w:val="889"/>
     <w:uiPriority w:val="99"/>
     <w:pPr>
       <w:pBdr/>
@@ -29458,9 +29700,9 @@
       </w:tcPr>
     </w:tblStylePr>
   </w:style>
-  <w:style w:type="table" w:styleId="134">
+  <w:style w:type="table" w:styleId="823">
     <w:name w:val="Bordered - Accent 3"/>
-    <w:basedOn w:val="666"/>
+    <w:basedOn w:val="889"/>
     <w:uiPriority w:val="99"/>
     <w:pPr>
       <w:pBdr/>
@@ -29689,9 +29931,9 @@
       </w:tcPr>
     </w:tblStylePr>
   </w:style>
-  <w:style w:type="table" w:styleId="135">
+  <w:style w:type="table" w:styleId="824">
     <w:name w:val="Bordered - Accent 4"/>
-    <w:basedOn w:val="666"/>
+    <w:basedOn w:val="889"/>
     <w:uiPriority w:val="99"/>
     <w:pPr>
       <w:pBdr/>
@@ -29920,9 +30162,9 @@
       </w:tcPr>
     </w:tblStylePr>
   </w:style>
-  <w:style w:type="table" w:styleId="136">
+  <w:style w:type="table" w:styleId="825">
     <w:name w:val="Bordered - Accent 5"/>
-    <w:basedOn w:val="666"/>
+    <w:basedOn w:val="889"/>
     <w:uiPriority w:val="99"/>
     <w:pPr>
       <w:pBdr/>
@@ -30151,9 +30393,9 @@
       </w:tcPr>
     </w:tblStylePr>
   </w:style>
-  <w:style w:type="table" w:styleId="137">
+  <w:style w:type="table" w:styleId="826">
     <w:name w:val="Bordered - Accent 6"/>
-    <w:basedOn w:val="666"/>
+    <w:basedOn w:val="889"/>
     <w:uiPriority w:val="99"/>
     <w:pPr>
       <w:pBdr/>
@@ -30382,11 +30624,11 @@
       </w:tcPr>
     </w:tblStylePr>
   </w:style>
-  <w:style w:type="paragraph" w:styleId="139">
+  <w:style w:type="paragraph" w:styleId="827">
     <w:name w:val="Heading 1"/>
-    <w:basedOn w:val="664"/>
-    <w:next w:val="664"/>
-    <w:link w:val="150"/>
+    <w:basedOn w:val="887"/>
+    <w:next w:val="887"/>
+    <w:link w:val="836"/>
     <w:uiPriority w:val="9"/>
     <w:qFormat/>
     <w:pPr>
@@ -30404,11 +30646,11 @@
       <w:szCs w:val="40"/>
     </w:rPr>
   </w:style>
-  <w:style w:type="paragraph" w:styleId="140">
+  <w:style w:type="paragraph" w:styleId="828">
     <w:name w:val="Heading 2"/>
-    <w:basedOn w:val="664"/>
-    <w:next w:val="664"/>
-    <w:link w:val="151"/>
+    <w:basedOn w:val="887"/>
+    <w:next w:val="887"/>
+    <w:link w:val="837"/>
     <w:uiPriority w:val="9"/>
     <w:unhideWhenUsed/>
     <w:qFormat/>
@@ -30427,11 +30669,11 @@
       <w:szCs w:val="32"/>
     </w:rPr>
   </w:style>
-  <w:style w:type="paragraph" w:styleId="141">
+  <w:style w:type="paragraph" w:styleId="829">
     <w:name w:val="Heading 3"/>
-    <w:basedOn w:val="664"/>
-    <w:next w:val="664"/>
-    <w:link w:val="152"/>
+    <w:basedOn w:val="887"/>
+    <w:next w:val="887"/>
+    <w:link w:val="838"/>
     <w:uiPriority w:val="9"/>
     <w:unhideWhenUsed/>
     <w:qFormat/>
@@ -30450,11 +30692,11 @@
       <w:szCs w:val="28"/>
     </w:rPr>
   </w:style>
-  <w:style w:type="paragraph" w:styleId="142">
+  <w:style w:type="paragraph" w:styleId="830">
     <w:name w:val="Heading 4"/>
-    <w:basedOn w:val="664"/>
-    <w:next w:val="664"/>
-    <w:link w:val="153"/>
+    <w:basedOn w:val="887"/>
+    <w:next w:val="887"/>
+    <w:link w:val="839"/>
     <w:uiPriority w:val="9"/>
     <w:unhideWhenUsed/>
     <w:qFormat/>
@@ -30473,11 +30715,11 @@
       <w:color w:val="0f4761" w:themeColor="accent1" w:themeShade="BF"/>
     </w:rPr>
   </w:style>
-  <w:style w:type="paragraph" w:styleId="143">
+  <w:style w:type="paragraph" w:styleId="831">
     <w:name w:val="Heading 5"/>
-    <w:basedOn w:val="664"/>
-    <w:next w:val="664"/>
-    <w:link w:val="154"/>
+    <w:basedOn w:val="887"/>
+    <w:next w:val="887"/>
+    <w:link w:val="840"/>
     <w:uiPriority w:val="9"/>
     <w:unhideWhenUsed/>
     <w:qFormat/>
@@ -30494,11 +30736,11 @@
       <w:color w:val="0f4761" w:themeColor="accent1" w:themeShade="BF"/>
     </w:rPr>
   </w:style>
-  <w:style w:type="paragraph" w:styleId="144">
+  <w:style w:type="paragraph" w:styleId="832">
     <w:name w:val="Heading 6"/>
-    <w:basedOn w:val="664"/>
-    <w:next w:val="664"/>
-    <w:link w:val="155"/>
+    <w:basedOn w:val="887"/>
+    <w:next w:val="887"/>
+    <w:link w:val="841"/>
     <w:uiPriority w:val="9"/>
     <w:unhideWhenUsed/>
     <w:qFormat/>
@@ -30517,11 +30759,11 @@
       <w:color w:val="595959" w:themeColor="text1" w:themeTint="A6"/>
     </w:rPr>
   </w:style>
-  <w:style w:type="paragraph" w:styleId="145">
+  <w:style w:type="paragraph" w:styleId="833">
     <w:name w:val="Heading 7"/>
-    <w:basedOn w:val="664"/>
-    <w:next w:val="664"/>
-    <w:link w:val="156"/>
+    <w:basedOn w:val="887"/>
+    <w:next w:val="887"/>
+    <w:link w:val="842"/>
     <w:uiPriority w:val="9"/>
     <w:unhideWhenUsed/>
     <w:qFormat/>
@@ -30538,11 +30780,11 @@
       <w:color w:val="595959" w:themeColor="text1" w:themeTint="A6"/>
     </w:rPr>
   </w:style>
-  <w:style w:type="paragraph" w:styleId="146">
+  <w:style w:type="paragraph" w:styleId="834">
     <w:name w:val="Heading 8"/>
-    <w:basedOn w:val="664"/>
-    <w:next w:val="664"/>
-    <w:link w:val="157"/>
+    <w:basedOn w:val="887"/>
+    <w:next w:val="887"/>
+    <w:link w:val="843"/>
     <w:uiPriority w:val="9"/>
     <w:unhideWhenUsed/>
     <w:qFormat/>
@@ -30561,11 +30803,11 @@
       <w:color w:val="272727" w:themeColor="text1" w:themeTint="D8"/>
     </w:rPr>
   </w:style>
-  <w:style w:type="paragraph" w:styleId="147">
+  <w:style w:type="paragraph" w:styleId="835">
     <w:name w:val="Heading 9"/>
-    <w:basedOn w:val="664"/>
-    <w:next w:val="664"/>
-    <w:link w:val="158"/>
+    <w:basedOn w:val="887"/>
+    <w:next w:val="887"/>
+    <w:link w:val="844"/>
     <w:uiPriority w:val="9"/>
     <w:unhideWhenUsed/>
     <w:qFormat/>
@@ -30584,10 +30826,10 @@
       <w:color w:val="272727" w:themeColor="text1" w:themeTint="D8"/>
     </w:rPr>
   </w:style>
-  <w:style w:type="character" w:styleId="150">
+  <w:style w:type="character" w:styleId="836">
     <w:name w:val="Heading 1 Char"/>
-    <w:basedOn w:val="665"/>
-    <w:link w:val="139"/>
+    <w:basedOn w:val="888"/>
+    <w:link w:val="827"/>
     <w:uiPriority w:val="9"/>
     <w:pPr>
       <w:pBdr/>
@@ -30601,10 +30843,10 @@
       <w:szCs w:val="40"/>
     </w:rPr>
   </w:style>
-  <w:style w:type="character" w:styleId="151">
+  <w:style w:type="character" w:styleId="837">
     <w:name w:val="Heading 2 Char"/>
-    <w:basedOn w:val="665"/>
-    <w:link w:val="140"/>
+    <w:basedOn w:val="888"/>
+    <w:link w:val="828"/>
     <w:uiPriority w:val="9"/>
     <w:pPr>
       <w:pBdr/>
@@ -30618,10 +30860,10 @@
       <w:szCs w:val="32"/>
     </w:rPr>
   </w:style>
-  <w:style w:type="character" w:styleId="152">
+  <w:style w:type="character" w:styleId="838">
     <w:name w:val="Heading 3 Char"/>
-    <w:basedOn w:val="665"/>
-    <w:link w:val="141"/>
+    <w:basedOn w:val="888"/>
+    <w:link w:val="829"/>
     <w:uiPriority w:val="9"/>
     <w:pPr>
       <w:pBdr/>
@@ -30635,10 +30877,10 @@
       <w:szCs w:val="28"/>
     </w:rPr>
   </w:style>
-  <w:style w:type="character" w:styleId="153">
+  <w:style w:type="character" w:styleId="839">
     <w:name w:val="Heading 4 Char"/>
-    <w:basedOn w:val="665"/>
-    <w:link w:val="142"/>
+    <w:basedOn w:val="888"/>
+    <w:link w:val="830"/>
     <w:uiPriority w:val="9"/>
     <w:pPr>
       <w:pBdr/>
@@ -30652,10 +30894,10 @@
       <w:color w:val="0f4761" w:themeColor="accent1" w:themeShade="BF"/>
     </w:rPr>
   </w:style>
-  <w:style w:type="character" w:styleId="154">
+  <w:style w:type="character" w:styleId="840">
     <w:name w:val="Heading 5 Char"/>
-    <w:basedOn w:val="665"/>
-    <w:link w:val="143"/>
+    <w:basedOn w:val="888"/>
+    <w:link w:val="831"/>
     <w:uiPriority w:val="9"/>
     <w:pPr>
       <w:pBdr/>
@@ -30667,10 +30909,10 @@
       <w:color w:val="0f4761" w:themeColor="accent1" w:themeShade="BF"/>
     </w:rPr>
   </w:style>
-  <w:style w:type="character" w:styleId="155">
+  <w:style w:type="character" w:styleId="841">
     <w:name w:val="Heading 6 Char"/>
-    <w:basedOn w:val="665"/>
-    <w:link w:val="144"/>
+    <w:basedOn w:val="888"/>
+    <w:link w:val="832"/>
     <w:uiPriority w:val="9"/>
     <w:pPr>
       <w:pBdr/>
@@ -30684,10 +30926,10 @@
       <w:color w:val="595959" w:themeColor="text1" w:themeTint="A6"/>
     </w:rPr>
   </w:style>
-  <w:style w:type="character" w:styleId="156">
+  <w:style w:type="character" w:styleId="842">
     <w:name w:val="Heading 7 Char"/>
-    <w:basedOn w:val="665"/>
-    <w:link w:val="145"/>
+    <w:basedOn w:val="888"/>
+    <w:link w:val="833"/>
     <w:uiPriority w:val="9"/>
     <w:pPr>
       <w:pBdr/>
@@ -30699,10 +30941,10 @@
       <w:color w:val="595959" w:themeColor="text1" w:themeTint="A6"/>
     </w:rPr>
   </w:style>
-  <w:style w:type="character" w:styleId="157">
+  <w:style w:type="character" w:styleId="843">
     <w:name w:val="Heading 8 Char"/>
-    <w:basedOn w:val="665"/>
-    <w:link w:val="146"/>
+    <w:basedOn w:val="888"/>
+    <w:link w:val="834"/>
     <w:uiPriority w:val="9"/>
     <w:pPr>
       <w:pBdr/>
@@ -30716,10 +30958,10 @@
       <w:color w:val="272727" w:themeColor="text1" w:themeTint="D8"/>
     </w:rPr>
   </w:style>
-  <w:style w:type="character" w:styleId="158">
+  <w:style w:type="character" w:styleId="844">
     <w:name w:val="Heading 9 Char"/>
-    <w:basedOn w:val="665"/>
-    <w:link w:val="147"/>
+    <w:basedOn w:val="888"/>
+    <w:link w:val="835"/>
     <w:uiPriority w:val="9"/>
     <w:pPr>
       <w:pBdr/>
@@ -30733,11 +30975,11 @@
       <w:color w:val="272727" w:themeColor="text1" w:themeTint="D8"/>
     </w:rPr>
   </w:style>
-  <w:style w:type="paragraph" w:styleId="159">
+  <w:style w:type="paragraph" w:styleId="845">
     <w:name w:val="Title"/>
-    <w:basedOn w:val="664"/>
-    <w:next w:val="664"/>
-    <w:link w:val="160"/>
+    <w:basedOn w:val="887"/>
+    <w:next w:val="887"/>
+    <w:link w:val="846"/>
     <w:uiPriority w:val="10"/>
     <w:qFormat/>
     <w:pPr>
@@ -30753,10 +30995,10 @@
       <w:szCs w:val="56"/>
     </w:rPr>
   </w:style>
-  <w:style w:type="character" w:styleId="160">
+  <w:style w:type="character" w:styleId="846">
     <w:name w:val="Title Char"/>
-    <w:basedOn w:val="665"/>
-    <w:link w:val="159"/>
+    <w:basedOn w:val="888"/>
+    <w:link w:val="845"/>
     <w:uiPriority w:val="10"/>
     <w:pPr>
       <w:pBdr/>
@@ -30770,11 +31012,11 @@
       <w:szCs w:val="56"/>
     </w:rPr>
   </w:style>
-  <w:style w:type="paragraph" w:styleId="161">
+  <w:style w:type="paragraph" w:styleId="847">
     <w:name w:val="Subtitle"/>
-    <w:basedOn w:val="664"/>
-    <w:next w:val="664"/>
-    <w:link w:val="162"/>
+    <w:basedOn w:val="887"/>
+    <w:next w:val="887"/>
+    <w:link w:val="848"/>
     <w:uiPriority w:val="11"/>
     <w:qFormat/>
     <w:pPr>
@@ -30792,10 +31034,10 @@
       <w:szCs w:val="28"/>
     </w:rPr>
   </w:style>
-  <w:style w:type="character" w:styleId="162">
+  <w:style w:type="character" w:styleId="848">
     <w:name w:val="Subtitle Char"/>
-    <w:basedOn w:val="665"/>
-    <w:link w:val="161"/>
+    <w:basedOn w:val="888"/>
+    <w:link w:val="847"/>
     <w:uiPriority w:val="11"/>
     <w:pPr>
       <w:pBdr/>
@@ -30809,11 +31051,11 @@
       <w:szCs w:val="28"/>
     </w:rPr>
   </w:style>
-  <w:style w:type="paragraph" w:styleId="163">
+  <w:style w:type="paragraph" w:styleId="849">
     <w:name w:val="Quote"/>
-    <w:basedOn w:val="664"/>
-    <w:next w:val="664"/>
-    <w:link w:val="164"/>
+    <w:basedOn w:val="887"/>
+    <w:next w:val="887"/>
+    <w:link w:val="850"/>
     <w:uiPriority w:val="29"/>
     <w:qFormat/>
     <w:pPr>
@@ -30828,10 +31070,10 @@
       <w:color w:val="404040" w:themeColor="text1" w:themeTint="BF"/>
     </w:rPr>
   </w:style>
-  <w:style w:type="character" w:styleId="164">
+  <w:style w:type="character" w:styleId="850">
     <w:name w:val="Quote Char"/>
-    <w:basedOn w:val="665"/>
-    <w:link w:val="163"/>
+    <w:basedOn w:val="888"/>
+    <w:link w:val="849"/>
     <w:uiPriority w:val="29"/>
     <w:pPr>
       <w:pBdr/>
@@ -30844,9 +31086,9 @@
       <w:color w:val="404040" w:themeColor="text1" w:themeTint="BF"/>
     </w:rPr>
   </w:style>
-  <w:style w:type="paragraph" w:styleId="165">
+  <w:style w:type="paragraph" w:styleId="851">
     <w:name w:val="List Paragraph"/>
-    <w:basedOn w:val="664"/>
+    <w:basedOn w:val="887"/>
     <w:uiPriority w:val="34"/>
     <w:qFormat/>
     <w:pPr>
@@ -30856,9 +31098,9 @@
       <w:contextualSpacing w:val="true"/>
     </w:pPr>
   </w:style>
-  <w:style w:type="character" w:styleId="166">
+  <w:style w:type="character" w:styleId="852">
     <w:name w:val="Intense Emphasis"/>
-    <w:basedOn w:val="665"/>
+    <w:basedOn w:val="888"/>
     <w:uiPriority w:val="21"/>
     <w:qFormat/>
     <w:pPr>
@@ -30872,11 +31114,11 @@
       <w:color w:val="0f4761" w:themeColor="accent1" w:themeShade="BF"/>
     </w:rPr>
   </w:style>
-  <w:style w:type="paragraph" w:styleId="167">
+  <w:style w:type="paragraph" w:styleId="853">
     <w:name w:val="Intense Quote"/>
-    <w:basedOn w:val="664"/>
-    <w:next w:val="664"/>
-    <w:link w:val="168"/>
+    <w:basedOn w:val="887"/>
+    <w:next w:val="887"/>
+    <w:link w:val="854"/>
     <w:uiPriority w:val="30"/>
     <w:qFormat/>
     <w:pPr>
@@ -30894,10 +31136,10 @@
       <w:color w:val="0f4761" w:themeColor="accent1" w:themeShade="BF"/>
     </w:rPr>
   </w:style>
-  <w:style w:type="character" w:styleId="168">
+  <w:style w:type="character" w:styleId="854">
     <w:name w:val="Intense Quote Char"/>
-    <w:basedOn w:val="665"/>
-    <w:link w:val="167"/>
+    <w:basedOn w:val="888"/>
+    <w:link w:val="853"/>
     <w:uiPriority w:val="30"/>
     <w:pPr>
       <w:pBdr/>
@@ -30910,9 +31152,9 @@
       <w:color w:val="0f4761" w:themeColor="accent1" w:themeShade="BF"/>
     </w:rPr>
   </w:style>
-  <w:style w:type="character" w:styleId="169">
+  <w:style w:type="character" w:styleId="855">
     <w:name w:val="Intense Reference"/>
-    <w:basedOn w:val="665"/>
+    <w:basedOn w:val="888"/>
     <w:uiPriority w:val="32"/>
     <w:qFormat/>
     <w:pPr>
@@ -30928,9 +31170,9 @@
       <w:spacing w:val="5"/>
     </w:rPr>
   </w:style>
-  <w:style w:type="paragraph" w:styleId="170">
+  <w:style w:type="paragraph" w:styleId="856">
     <w:name w:val="No Spacing"/>
-    <w:basedOn w:val="664"/>
+    <w:basedOn w:val="887"/>
     <w:uiPriority w:val="1"/>
     <w:qFormat/>
     <w:pPr>
@@ -30939,9 +31181,9 @@
       <w:ind/>
     </w:pPr>
   </w:style>
-  <w:style w:type="character" w:styleId="171">
+  <w:style w:type="character" w:styleId="857">
     <w:name w:val="Subtle Emphasis"/>
-    <w:basedOn w:val="665"/>
+    <w:basedOn w:val="888"/>
     <w:uiPriority w:val="19"/>
     <w:qFormat/>
     <w:pPr>
@@ -30955,9 +31197,9 @@
       <w:color w:val="404040" w:themeColor="text1" w:themeTint="BF"/>
     </w:rPr>
   </w:style>
-  <w:style w:type="character" w:styleId="172">
+  <w:style w:type="character" w:styleId="858">
     <w:name w:val="Emphasis"/>
-    <w:basedOn w:val="665"/>
+    <w:basedOn w:val="888"/>
     <w:uiPriority w:val="20"/>
     <w:qFormat/>
     <w:pPr>
@@ -30970,9 +31212,9 @@
       <w:iCs/>
     </w:rPr>
   </w:style>
-  <w:style w:type="character" w:styleId="173">
+  <w:style w:type="character" w:styleId="859">
     <w:name w:val="Strong"/>
-    <w:basedOn w:val="665"/>
+    <w:basedOn w:val="888"/>
     <w:uiPriority w:val="22"/>
     <w:qFormat/>
     <w:pPr>
@@ -30985,9 +31227,9 @@
       <w:bCs/>
     </w:rPr>
   </w:style>
-  <w:style w:type="character" w:styleId="174">
+  <w:style w:type="character" w:styleId="860">
     <w:name w:val="Subtle Reference"/>
-    <w:basedOn w:val="665"/>
+    <w:basedOn w:val="888"/>
     <w:uiPriority w:val="31"/>
     <w:qFormat/>
     <w:pPr>
@@ -31000,9 +31242,9 @@
       <w:color w:val="5a5a5a" w:themeColor="text1" w:themeTint="A5"/>
     </w:rPr>
   </w:style>
-  <w:style w:type="character" w:styleId="175">
+  <w:style w:type="character" w:styleId="861">
     <w:name w:val="Book Title"/>
-    <w:basedOn w:val="665"/>
+    <w:basedOn w:val="888"/>
     <w:uiPriority w:val="33"/>
     <w:qFormat/>
     <w:pPr>
@@ -31018,10 +31260,10 @@
       <w:spacing w:val="5"/>
     </w:rPr>
   </w:style>
-  <w:style w:type="paragraph" w:styleId="176">
+  <w:style w:type="paragraph" w:styleId="862">
     <w:name w:val="Header"/>
-    <w:basedOn w:val="664"/>
-    <w:link w:val="177"/>
+    <w:basedOn w:val="887"/>
+    <w:link w:val="863"/>
     <w:uiPriority w:val="99"/>
     <w:unhideWhenUsed/>
     <w:pPr>
@@ -31034,10 +31276,10 @@
       <w:ind/>
     </w:pPr>
   </w:style>
-  <w:style w:type="character" w:styleId="177">
+  <w:style w:type="character" w:styleId="863">
     <w:name w:val="Header Char"/>
-    <w:basedOn w:val="665"/>
-    <w:link w:val="176"/>
+    <w:basedOn w:val="888"/>
+    <w:link w:val="862"/>
     <w:uiPriority w:val="99"/>
     <w:pPr>
       <w:pBdr/>
@@ -31045,10 +31287,10 @@
       <w:ind/>
     </w:pPr>
   </w:style>
-  <w:style w:type="paragraph" w:styleId="178">
+  <w:style w:type="paragraph" w:styleId="864">
     <w:name w:val="Footer"/>
-    <w:basedOn w:val="664"/>
-    <w:link w:val="179"/>
+    <w:basedOn w:val="887"/>
+    <w:link w:val="865"/>
     <w:uiPriority w:val="99"/>
     <w:unhideWhenUsed/>
     <w:pPr>
@@ -31061,10 +31303,10 @@
       <w:ind/>
     </w:pPr>
   </w:style>
-  <w:style w:type="character" w:styleId="179">
+  <w:style w:type="character" w:styleId="865">
     <w:name w:val="Footer Char"/>
-    <w:basedOn w:val="665"/>
-    <w:link w:val="178"/>
+    <w:basedOn w:val="888"/>
+    <w:link w:val="864"/>
     <w:uiPriority w:val="99"/>
     <w:pPr>
       <w:pBdr/>
@@ -31072,10 +31314,10 @@
       <w:ind/>
     </w:pPr>
   </w:style>
-  <w:style w:type="paragraph" w:styleId="180">
+  <w:style w:type="paragraph" w:styleId="866">
     <w:name w:val="Caption"/>
-    <w:basedOn w:val="664"/>
-    <w:next w:val="664"/>
+    <w:basedOn w:val="887"/>
+    <w:next w:val="887"/>
     <w:uiPriority w:val="35"/>
     <w:unhideWhenUsed/>
     <w:qFormat/>
@@ -31092,10 +31334,10 @@
       <w:szCs w:val="18"/>
     </w:rPr>
   </w:style>
-  <w:style w:type="paragraph" w:styleId="181">
+  <w:style w:type="paragraph" w:styleId="867">
     <w:name w:val="footnote text"/>
-    <w:basedOn w:val="664"/>
-    <w:link w:val="182"/>
+    <w:basedOn w:val="887"/>
+    <w:link w:val="868"/>
     <w:uiPriority w:val="99"/>
     <w:semiHidden/>
     <w:unhideWhenUsed/>
@@ -31109,10 +31351,10 @@
       <w:szCs w:val="20"/>
     </w:rPr>
   </w:style>
-  <w:style w:type="character" w:styleId="182">
+  <w:style w:type="character" w:styleId="868">
     <w:name w:val="Footnote Text Char"/>
-    <w:basedOn w:val="665"/>
-    <w:link w:val="181"/>
+    <w:basedOn w:val="888"/>
+    <w:link w:val="867"/>
     <w:uiPriority w:val="99"/>
     <w:semiHidden/>
     <w:pPr>
@@ -31125,9 +31367,9 @@
       <w:szCs w:val="20"/>
     </w:rPr>
   </w:style>
-  <w:style w:type="character" w:styleId="183">
+  <w:style w:type="character" w:styleId="869">
     <w:name w:val="footnote reference"/>
-    <w:basedOn w:val="665"/>
+    <w:basedOn w:val="888"/>
     <w:uiPriority w:val="99"/>
     <w:semiHidden/>
     <w:unhideWhenUsed/>
@@ -31140,10 +31382,10 @@
       <w:vertAlign w:val="superscript"/>
     </w:rPr>
   </w:style>
-  <w:style w:type="paragraph" w:styleId="184">
+  <w:style w:type="paragraph" w:styleId="870">
     <w:name w:val="endnote text"/>
-    <w:basedOn w:val="664"/>
-    <w:link w:val="185"/>
+    <w:basedOn w:val="887"/>
+    <w:link w:val="871"/>
     <w:uiPriority w:val="99"/>
     <w:semiHidden/>
     <w:unhideWhenUsed/>
@@ -31157,10 +31399,10 @@
       <w:szCs w:val="20"/>
     </w:rPr>
   </w:style>
-  <w:style w:type="character" w:styleId="185">
+  <w:style w:type="character" w:styleId="871">
     <w:name w:val="Endnote Text Char"/>
-    <w:basedOn w:val="665"/>
-    <w:link w:val="184"/>
+    <w:basedOn w:val="888"/>
+    <w:link w:val="870"/>
     <w:uiPriority w:val="99"/>
     <w:semiHidden/>
     <w:pPr>
@@ -31173,9 +31415,9 @@
       <w:szCs w:val="20"/>
     </w:rPr>
   </w:style>
-  <w:style w:type="character" w:styleId="186">
+  <w:style w:type="character" w:styleId="872">
     <w:name w:val="endnote reference"/>
-    <w:basedOn w:val="665"/>
+    <w:basedOn w:val="888"/>
     <w:uiPriority w:val="99"/>
     <w:semiHidden/>
     <w:unhideWhenUsed/>
@@ -31188,9 +31430,9 @@
       <w:vertAlign w:val="superscript"/>
     </w:rPr>
   </w:style>
-  <w:style w:type="character" w:styleId="187">
+  <w:style w:type="character" w:styleId="873">
     <w:name w:val="Hyperlink"/>
-    <w:basedOn w:val="665"/>
+    <w:basedOn w:val="888"/>
     <w:uiPriority w:val="99"/>
     <w:unhideWhenUsed/>
     <w:pPr>
@@ -31203,9 +31445,9 @@
       <w:u w:val="single"/>
     </w:rPr>
   </w:style>
-  <w:style w:type="character" w:styleId="188">
+  <w:style w:type="character" w:styleId="874">
     <w:name w:val="FollowedHyperlink"/>
-    <w:basedOn w:val="665"/>
+    <w:basedOn w:val="888"/>
     <w:uiPriority w:val="99"/>
     <w:semiHidden/>
     <w:unhideWhenUsed/>
@@ -31219,10 +31461,10 @@
       <w:u w:val="single"/>
     </w:rPr>
   </w:style>
-  <w:style w:type="paragraph" w:styleId="189">
+  <w:style w:type="paragraph" w:styleId="875">
     <w:name w:val="toc 1"/>
-    <w:basedOn w:val="664"/>
-    <w:next w:val="664"/>
+    <w:basedOn w:val="887"/>
+    <w:next w:val="887"/>
     <w:uiPriority w:val="39"/>
     <w:unhideWhenUsed/>
     <w:pPr>
@@ -31231,10 +31473,10 @@
       <w:ind/>
     </w:pPr>
   </w:style>
-  <w:style w:type="paragraph" w:styleId="190">
+  <w:style w:type="paragraph" w:styleId="876">
     <w:name w:val="toc 2"/>
-    <w:basedOn w:val="664"/>
-    <w:next w:val="664"/>
+    <w:basedOn w:val="887"/>
+    <w:next w:val="887"/>
     <w:uiPriority w:val="39"/>
     <w:unhideWhenUsed/>
     <w:pPr>
@@ -31243,10 +31485,10 @@
       <w:ind w:left="220"/>
     </w:pPr>
   </w:style>
-  <w:style w:type="paragraph" w:styleId="191">
+  <w:style w:type="paragraph" w:styleId="877">
     <w:name w:val="toc 3"/>
-    <w:basedOn w:val="664"/>
-    <w:next w:val="664"/>
+    <w:basedOn w:val="887"/>
+    <w:next w:val="887"/>
     <w:uiPriority w:val="39"/>
     <w:unhideWhenUsed/>
     <w:pPr>
@@ -31255,10 +31497,10 @@
       <w:ind w:left="440"/>
     </w:pPr>
   </w:style>
-  <w:style w:type="paragraph" w:styleId="192">
+  <w:style w:type="paragraph" w:styleId="878">
     <w:name w:val="toc 4"/>
-    <w:basedOn w:val="664"/>
-    <w:next w:val="664"/>
+    <w:basedOn w:val="887"/>
+    <w:next w:val="887"/>
     <w:uiPriority w:val="39"/>
     <w:unhideWhenUsed/>
     <w:pPr>
@@ -31267,10 +31509,10 @@
       <w:ind w:left="660"/>
     </w:pPr>
   </w:style>
-  <w:style w:type="paragraph" w:styleId="193">
+  <w:style w:type="paragraph" w:styleId="879">
     <w:name w:val="toc 5"/>
-    <w:basedOn w:val="664"/>
-    <w:next w:val="664"/>
+    <w:basedOn w:val="887"/>
+    <w:next w:val="887"/>
     <w:uiPriority w:val="39"/>
     <w:unhideWhenUsed/>
     <w:pPr>
@@ -31279,10 +31521,10 @@
       <w:ind w:left="880"/>
     </w:pPr>
   </w:style>
-  <w:style w:type="paragraph" w:styleId="194">
+  <w:style w:type="paragraph" w:styleId="880">
     <w:name w:val="toc 6"/>
-    <w:basedOn w:val="664"/>
-    <w:next w:val="664"/>
+    <w:basedOn w:val="887"/>
+    <w:next w:val="887"/>
     <w:uiPriority w:val="39"/>
     <w:unhideWhenUsed/>
     <w:pPr>
@@ -31291,10 +31533,10 @@
       <w:ind w:left="1100"/>
     </w:pPr>
   </w:style>
-  <w:style w:type="paragraph" w:styleId="195">
+  <w:style w:type="paragraph" w:styleId="881">
     <w:name w:val="toc 7"/>
-    <w:basedOn w:val="664"/>
-    <w:next w:val="664"/>
+    <w:basedOn w:val="887"/>
+    <w:next w:val="887"/>
     <w:uiPriority w:val="39"/>
     <w:unhideWhenUsed/>
     <w:pPr>
@@ -31303,10 +31545,10 @@
       <w:ind w:left="1320"/>
     </w:pPr>
   </w:style>
-  <w:style w:type="paragraph" w:styleId="196">
+  <w:style w:type="paragraph" w:styleId="882">
     <w:name w:val="toc 8"/>
-    <w:basedOn w:val="664"/>
-    <w:next w:val="664"/>
+    <w:basedOn w:val="887"/>
+    <w:next w:val="887"/>
     <w:uiPriority w:val="39"/>
     <w:unhideWhenUsed/>
     <w:pPr>
@@ -31315,10 +31557,10 @@
       <w:ind w:left="1540"/>
     </w:pPr>
   </w:style>
-  <w:style w:type="paragraph" w:styleId="197">
+  <w:style w:type="paragraph" w:styleId="883">
     <w:name w:val="toc 9"/>
-    <w:basedOn w:val="664"/>
-    <w:next w:val="664"/>
+    <w:basedOn w:val="887"/>
+    <w:next w:val="887"/>
     <w:uiPriority w:val="39"/>
     <w:unhideWhenUsed/>
     <w:pPr>
@@ -31327,9 +31569,9 @@
       <w:ind w:left="1760"/>
     </w:pPr>
   </w:style>
-  <w:style w:type="character" w:styleId="198">
+  <w:style w:type="character" w:styleId="884">
     <w:name w:val="Placeholder Text"/>
-    <w:basedOn w:val="665"/>
+    <w:basedOn w:val="888"/>
     <w:uiPriority w:val="99"/>
     <w:semiHidden/>
     <w:pPr>
@@ -31341,7 +31583,7 @@
       <w:color w:val="666666"/>
     </w:rPr>
   </w:style>
-  <w:style w:type="paragraph" w:styleId="208">
+  <w:style w:type="paragraph" w:styleId="885">
     <w:name w:val="TOC Heading"/>
     <w:uiPriority w:val="39"/>
     <w:unhideWhenUsed/>
@@ -31351,10 +31593,10 @@
       <w:ind/>
     </w:pPr>
   </w:style>
-  <w:style w:type="paragraph" w:styleId="209">
+  <w:style w:type="paragraph" w:styleId="886">
     <w:name w:val="table of figures"/>
-    <w:basedOn w:val="664"/>
-    <w:next w:val="664"/>
+    <w:basedOn w:val="887"/>
+    <w:next w:val="887"/>
     <w:uiPriority w:val="99"/>
     <w:unhideWhenUsed/>
     <w:pPr>
@@ -31363,7 +31605,7 @@
       <w:ind/>
     </w:pPr>
   </w:style>
-  <w:style w:type="paragraph" w:styleId="664" w:default="1">
+  <w:style w:type="paragraph" w:styleId="887" w:default="1">
     <w:name w:val="Normal"/>
     <w:qFormat/>
     <w:pPr>
@@ -31377,7 +31619,7 @@
       <w:sz w:val="22"/>
     </w:rPr>
   </w:style>
-  <w:style w:type="character" w:styleId="665" w:default="1">
+  <w:style w:type="character" w:styleId="888" w:default="1">
     <w:name w:val="Default Paragraph Font"/>
     <w:uiPriority w:val="1"/>
     <w:semiHidden/>
@@ -31388,7 +31630,7 @@
       <w:ind/>
     </w:pPr>
   </w:style>
-  <w:style w:type="table" w:styleId="666" w:default="1">
+  <w:style w:type="table" w:styleId="889" w:default="1">
     <w:name w:val="Normal Table"/>
     <w:uiPriority w:val="99"/>
     <w:semiHidden/>
@@ -31581,7 +31823,7 @@
       </w:tcPr>
     </w:tblStylePr>
   </w:style>
-  <w:style w:type="numbering" w:styleId="667" w:default="1">
+  <w:style w:type="numbering" w:styleId="890" w:default="1">
     <w:name w:val="No List"/>
     <w:uiPriority w:val="99"/>
     <w:semiHidden/>

</xml_diff>